<commit_message>
Reconcile revision 6 and the round-6 letter with release 2.8.2
- Manuscript and letter now describe the event-time block-test semantics
  and the zadd_max outage rule as implemented in b84e7f8.
- scripts/check_condition.py evaluates Equations 2-4 with unfitted inputs
  on the E4 boundary runs (results/condition_check.{md,json}): ordering
  correct in all 18 cells where the estimates differ; 2 cells tie at N.
- results/store_expiry_check.md measures the memory-store/Redis expiry
  difference on the 102-run sample (27 runs change, 4 in leakage); the
  paper and letter declare it.
- CHANGELOG and docs/evaluation.md: reversal wording, known edge, store
  measurement and the operating-condition check.

No source code changes; recorded results unchanged.

Co-Authored-By: Claude Opus 5.5 <noreply@anthropic.com>
Claude-Session: https://claude.ai/code/session_01RjWdFzUgYk6Hwie2YbnvyG
</commit_message>
<xml_diff>
--- a/paper/rebuttal_round6.docx
+++ b/paper/rebuttal_round6.docx
@@ -63,7 +63,7 @@
         <w:t xml:space="preserve">Revised:</w:t>
       </w:r>
       <w:r>
-        <w:t xml:space="preserve"> manuscript revision 6, in the commit that accompanies this letter, and release 2.8.2 ([2.8.2 commit]), which carries the implementation repair for M4, the documented verdict semantics for M5, and scripts/check_condition.py with its output results/condition_check.md. No simulated result changes. Table, figure and equation numbers refer to revision 6 unless marked 'old'; Section 6 of this letter maps old figure numbers to new ones.</w:t>
+        <w:t xml:space="preserve"> release 2.8.2, which consists of commit b84e7f8 (the repository repairs for M4 and M5 and the revised part D of the analyses) and the commit that accompanies this letter (scripts/check_condition.py with its output results/condition_check.md, manuscript revision 6 and this letter); the v2.8.2 tag is on the latter. No simulated result changes: 102 recorded runs replayed with 2.8.2 are identical, and 434 tests pass, eighteen of them across two instances on a real Redis. Table, figure and equation numbers refer to revision 6 unless marked 'old'; Section 6 of this letter maps old figure numbers to new ones.</w:t>
       </w:r>
     </w:p>
     <w:p>
@@ -94,7 +94,7 @@
         <w:t xml:space="preserve">What changed.</w:t>
       </w:r>
       <w:r>
-        <w:t xml:space="preserve"> (1) Section 5 is now 'Leakage estimates and a heuristic crossover'. It defines one estimand, the SMS sent to a pumper's numbers over an attack of T minutes from a cold start by a pumper that solves no challenge and holds no verified history; states the counter's actual windows (opened by a block's first reserved SMS); writes Equation 3 as a bound (≤); and calls Equation 4 a heuristic crossover between a bound and an approximation, 'not a necessary condition'. (2) Nothing is fitted any more. τ comes from the configuration (resolution timeout, delivery delay and half the timeout worker's period: 2.55 minutes) and λ and N from each run's offered requests. With these inputs Equation 2 gives 105, 139 and 240 messages against the measured 110, 144 and 242 on 3, 10 and 30 blocks, and Equation 4 orders the two policies correctly in 19 of the 20 E4 cells. Figure 4's overlays are now these per-run estimates. (3) The service share is derived for the implemented, arrival-anchored windows (7.3 % and 27 % at m = q/2 and m = q, not 3.8 % and 20 %), and the 0.12-point conversion factor is gone. (4) Section 4.2 states each effect type's semantics separately. Verdicts start at processing time, by design and now documented; M4 is repaired in 2.8.2 with a two-send regression test. (5) The wording items Q1–Q10 are corrected. Table 9 is split into a four-carrier panel and a poisoner panel with named reference arms and intervals, and Figure 5 is split into two full-width figures. The ablation grid, dilution and trade-off figures move to the artifact, so that the destination comparison comes sooner.</w:t>
+        <w:t xml:space="preserve"> (1) Section 5 is now 'Leakage estimates and a heuristic crossover'. It defines one estimand, the SMS sent to a pumper's numbers over an attack of T minutes from a cold start by a pumper that solves no challenge and holds no verified history; states the counter's actual windows (opened by a block's first reserved SMS); writes Equation 3 as a bound (≤); and calls Equation 4 a heuristic crossover between a bound and an approximation, 'not a necessary condition'. (2) Nothing is fitted any more. τ comes from the configuration (resolution timeout, delivery delay and half the timeout worker's period: 2.55 minutes) and λ and N from each run's offered requests. With these inputs Equation 2 gives 105, 139 and 240 messages against the measured 110, 144 and 242 on 3, 10 and 30 blocks, and Equation 4 orders the two policies correctly in all 18 E4 cells where its two estimates differ; in the other two, both equal N. Figure 4's overlays are now these per-run estimates. (3) The service share is derived for the implemented, arrival-anchored windows (7.3 % and 27 % at m = q/2 and m = q, not 3.8 % and 20 %), and the 0.12-point conversion factor is gone. (4) Release 2.8.2 repairs both replay defects. A block keeps its newest outage failure time, and a block-test event is applied at its transition's time, with defined rules for crossings, escalation and reordering. Section 4.2 states each effect type's semantics. (5) The wording items Q1–Q10 are corrected. Table 9 is split into a four-carrier panel and a poisoner panel with named reference arms and intervals, and Figure 5 is split into two full-width figures. The ablation grid, dilution and trade-off figures move to the artifact, so that the destination comparison comes sooner.</w:t>
       </w:r>
     </w:p>
     <w:p>
@@ -109,7 +109,7 @@
         <w:t xml:space="preserve">The closing question.</w:t>
       </w:r>
       <w:r>
-        <w:t xml:space="preserve"> We give a narrow answer, separating the algebraic part from the behavioural part, and Section 7 of this letter sets it out. Within its stated scope, the heuristic predicts something the elementary quota argument does not. A slow or paced pumper on a few blocks is held more tightly by the tests than by the counter (23 against 71 messages on three blocks in an hour), because the tests' leakage is dominated by sends in flight, λτ, and that term shrinks with the rate. A fast pumper on the same blocks is held more tightly by the counter (71 against 110). The crossover moves as λτ/(qw − k) with the horizon. The check that it is not a restatement of the simulation is that every constant comes from the configuration or the run's own offered requests, none from E4's leakage, and the ordering still matches in 19 of 20 cells from 3 to 300 blocks and 20 to 60 minutes. The same unfitted Equation 2 was checked earlier on a different study (the main evaluation's 18 spread configurations, seeds 0–9), where it erred by 1.6 to 7.9 messages per run in the ten unsaturated ones. It remains a check inside one simulator, not external validation, and the paper says so.</w:t>
+        <w:t xml:space="preserve"> We give a narrow answer, separating the algebraic part from the behavioural part, and Section 7 of this letter sets it out. Within its stated scope, the heuristic predicts something the elementary quota argument does not. A slow or paced pumper on a few blocks is held more tightly by the tests than by the counter (23 against 71 messages on three blocks in an hour), because the tests' leakage is dominated by sends in flight, λτ, and that term shrinks with the rate. A fast pumper on the same blocks is held more tightly by the counter (71 against 110). The crossover moves as λτ/(qw − k) with the horizon. The check that it is not a restatement of the simulation is that every constant comes from the configuration or the run's own offered requests, none from E4's leakage, and the ordering matches in all 18 cells where the estimates differ, from 3 to 300 blocks and 20 to 60 minutes. Equation 2 with the same configured timings was checked earlier on a different study, the main evaluation's 18 spread configurations on seeds 0–9. Its never-verifying pumpers there were estimated within 5.4 to 7.9 messages per run (3 to 7 %). It remains a check inside one simulator, not external validation, and the paper says so.</w:t>
       </w:r>
     </w:p>
     <w:p>
@@ -124,7 +124,7 @@
         <w:t xml:space="preserve">Manuscript.</w:t>
       </w:r>
       <w:r>
-        <w:t xml:space="preserve"> The scope is unchanged. The paper is 7,996 words from the title to the end of the reference list, counting tables, captions, declarations and references (alphanumeric tokens in the compiled PDF, figures as placeholders); a whitespace count gives 7,932. It compiles without overfull boxes in 24 pages.</w:t>
+        <w:t xml:space="preserve"> The scope is unchanged. The paper is 7,999 words from the title to the end of the reference list, counting tables, captions, declarations and references (alphanumeric tokens in the compiled PDF, figures as placeholders); a whitespace count gives 7,932. It compiles without overfull boxes in 24 pages.</w:t>
       </w:r>
     </w:p>
     <w:p>
@@ -169,10 +169,10 @@
           <w:b/>
           <w:bCs/>
         </w:rPr>
-        <w:t xml:space="preserve">Event-time verdicts (M5).</w:t>
-      </w:r>
-      <w:r>
-        <w:t xml:space="preserve"> Not implemented. We chose processing-time verdicts and narrowed the claims to match (M5).</w:t>
+        <w:t xml:space="preserve">Aligning the two stores (found while checking reproduction).</w:t>
+      </w:r>
+      <w:r>
+        <w:t xml:space="preserve"> The simulator's in-memory store keeps a sorted set's expiry from the write that created it, whereas Redis extends it on every write. In a simulated run, therefore, the outage detector's sets and Step 5's number-pattern sets empty a fixed time after their first write. We measured the effect on the 102-run reproduction sample with the memory store changed to Redis's rule (results/store_expiry_check.md): 27 runs change. Sixteen change only in the count of outage alerts, seven in other counts with leakage unchanged, and four in leakage, where an outage suspension of the block tests did or did not happen. In one of those four, a tuning run of the matched comparison, the change is 268 messages against 21. We left the rule unchanged so that the recorded results stand, and Section 6 states the difference with these numbers. Aligning the stores means rerunning the studies; we have not done that in this round and will if the reviewer considers it necessary.</w:t>
       </w:r>
     </w:p>
     <w:p>
@@ -400,7 +400,7 @@
         <w:spacing w:after="120"/>
       </w:pPr>
       <w:r>
-        <w:t xml:space="preserve">scripts/check_condition.py ([2.8.2 commit]) evaluates Equations 2, 3 and 4 for every recorded E4 security run from these inputs. It uses N, not the no-policy arm's measured leakage, as the cap, and min(N, …) in both equations, and writes results/condition_check.md. Results: the tests' estimate is 105, 139 and 240 against measured 110, 144 and 242 at 3, 10 and 30 blocks over an hour, and the counter's bound 72, 240 and 720 against 71, 240 and 679. The predicted ordering matches the measured ordering in 19 of 20 cells: 3 to 300 blocks, 20 and 60 minutes, full-rate and quota-paced pumpers. The exception is 300 blocks over 20 minutes, where both estimates equal N and the measured totals are 673 and 676. For paced pumpers the tests' estimate is low by about 20 % (18 against 23 on three blocks), and the ordering still holds.</w:t>
+        <w:t xml:space="preserve">scripts/check_condition.py (the commit accompanying this letter) evaluates Equations 2, 3 and 4 for every recorded E4 security run from these inputs. It uses N, not the no-policy arm's measured leakage, as the cap, and min(N, …) in both equations, and writes results/condition_check.md. Results: the tests' estimate is 105, 139 and 240 against measured 110, 144 and 242 at 3, 10 and 30 blocks over an hour, and the counter's bound 72, 240 and 720 against 71, 240 and 679. In the 18 cells where the two estimates differ (3 to 300 blocks, 20 and 60 minutes, full-rate and quota-paced pumpers), the predicted ordering matches the measured one in all 18. In the other two, at 300 blocks over 20 minutes, both estimates equal N and no ordering is predicted (measured 673 against 676 and 697 against 686). For paced pumpers on 3 to 30 blocks the tests' estimate is about 20 % low (18 against 23 on three blocks), and the ordering still holds.</w:t>
       </w:r>
     </w:p>
     <w:p>
@@ -408,7 +408,7 @@
         <w:spacing w:after="120"/>
       </w:pPr>
       <w:r>
-        <w:t xml:space="preserve">Figure 4's dotted lines are now Equation 3's bound and Equation 2's first-verdict estimate, evaluated per run from these inputs ('nothing fitted'). The caption says that lines join sampled settings and do not locate a crossover. The text places the crossover 'between sampled spreads'. Part D of scripts/run_round5_analyses.py, which used the empirical cap and the fitted intercept, is superseded by this check; its table remains labelled 'capped by none'.</w:t>
+        <w:t xml:space="preserve">Figure 4's dotted lines are now Equation 3's bound and Equation 2's first-verdict estimate, evaluated per run from these inputs ('nothing fitted'). The caption says that lines join sampled settings and do not locate a crossover. The text places the crossover 'between sampled spreads'. Part D of scripts/run_round5_analyses.py was revised in 2.8.2 (b84e7f8) along the reviewer's lines. It caps the counter's allowance at the offered volume N instead of the no-policy arm's leakage, caps the first-verdict estimate at N, computes the intercept (95) from the 3-block, 60-minute cell and marks that row as the fit and every other row as a check, and states the horizon mismatch. The manuscript uses the stronger, unfitted version above. The two agree on the full-rate pumper, a fitted 95 against a configured value of about 90. A single fitted intercept overstates the paced pumper's leakage, whose offered rate is far lower, and the per-run version does not.</w:t>
       </w:r>
     </w:p>
     <w:p>
@@ -416,7 +416,7 @@
         <w:spacing w:after="120"/>
       </w:pPr>
       <w:r>
-        <w:t xml:space="preserve">The main evaluation's spread study is a separate check with the same unfitted τ: 18 configurations on seeds 0–9, errors of 1.6 to 7.9 messages per run (1 to 13 %) in the ten unsaturated ones (Section 7.5). These are different seeds, attack rates and range layouts from E4. We still regard all of this as internal evidence.</w:t>
+        <w:t xml:space="preserve">The main evaluation's spread study is a separate check with the same configured timings: 18 configurations on seeds 0–9, errors of 1.6 to 7.9 messages per run (1 to 13 %) in the ten unsaturated ones (Section 7.5), and 5.4 to 7.9 (3 to 7 %) for the five whose carrier never verifies, where τ is 2.55 minutes. These are different seeds, attack rates and range layouts from E4. We still regard all of this as internal evidence.</w:t>
       </w:r>
     </w:p>
     <w:p>
@@ -431,7 +431,7 @@
         <w:t xml:space="preserve">Where:</w:t>
       </w:r>
       <w:r>
-        <w:t xml:space="preserve"> scripts/check_condition.py and results/condition_check.md ([2.8.2 commit]); paper/figures.py (unfitted_estimates). Manuscript Section 5, Section 7.6, Figure 4.</w:t>
+        <w:t xml:space="preserve"> scripts/check_condition.py and results/condition_check.md (the commit accompanying this letter); results/round5_analyses.md, part D (b84e7f8); paper/figures.py (unfitted_estimates). Manuscript Section 5, Section 7.6, Figure 4.</w:t>
       </w:r>
     </w:p>
     <w:p>
@@ -489,7 +489,7 @@
         <w:spacing w:after="120"/>
       </w:pPr>
       <w:r>
-        <w:t xml:space="preserve">The 0.12-points-per-point factor is removed. Section 7.6 now reports the measured losses (2.3 points at four sends per window and 5.5 at eight) as 'far below the idealized share beyond the quota (27 % at four), since most challenged users complete or switch to WhatsApp'. It no longer converts one into the other.</w:t>
+        <w:t xml:space="preserve">The 0.12-points-per-point factor is removed. Section 7.6 now reports the measured losses (2.3 points at four sends per window and 5.5 at eight) as 'far below the idealized share beyond the quota (27 % at four), since most challenged users complete or switch to WhatsApp'. It no longer converts one into the other. Part D of the analyses (2.8.2, b84e7f8) reports the exogenous and arrival-anchored shares side by side, and the README and docs/evaluation.md state that the window opens at a block's first accepted send.</w:t>
       </w:r>
     </w:p>
     <w:p>
@@ -504,7 +504,7 @@
         <w:t xml:space="preserve">Where:</w:t>
       </w:r>
       <w:r>
-        <w:t xml:space="preserve"> Manuscript Section 5 (last paragraph), Section 7.6.</w:t>
+        <w:t xml:space="preserve"> results/round5_analyses.md, part D (b84e7f8). Manuscript Section 5 (last paragraph), Section 7.6.</w:t>
       </w:r>
     </w:p>
     <w:p>
@@ -532,7 +532,7 @@
           <w:bCs/>
           <w:color w:val="1E6B3A"/>
         </w:rPr>
-        <w:t xml:space="preserve">Fixed in 2.8.2 ([2.8.2 commit])</w:t>
+        <w:t xml:space="preserve">Fixed in 2.8.2 (b84e7f8)</w:t>
       </w:r>
     </w:p>
     <w:p>
@@ -554,7 +554,7 @@
         <w:spacing w:after="120"/>
       </w:pPr>
       <w:r>
-        <w:t xml:space="preserve">Reproduced on 2.8.1 as described: the block's score went from 900 back to 0, and at 1,801 seconds the distinct-block window counted no block. In 2.8.2 the distinct-block set keeps the larger time when a block's member already exists: ZADD with GT on Redis, the same rule on the memory store. A replayed older failure therefore cannot move a block's latest failure time back. Per-send observations keep their own time, as in 2.8.1.</w:t>
+        <w:t xml:space="preserve">Reproduced on 2.8.1 as described: the block's score went from 900 back to 0, and at 1,801 seconds the 1,800-second distinct-block window counted no block. In 2.8.2 the distinct-block set is written with store.zadd_max, which adds a block or raises its score and never lowers it. On Redis this is one script, so the read and the write are atomic. A replayed older failure therefore cannot move a block's newest failure time back. Per-send observations keep their own time, as in 2.8.1, so an old observation alone still cannot re-enter the short receipt window.</w:t>
       </w:r>
     </w:p>
     <w:p>
@@ -562,7 +562,7 @@
         <w:spacing w:after="120"/>
       </w:pPr>
       <w:r>
-        <w:t xml:space="preserve">Tests: test_replayed_older_failure_keeps_the_blocks_latest_failure_time (the reviewer's two-send sequence; it fails on 2.8.1) and test_replayed_older_failure_alone_does_not_refresh_its_block (the 2.8.1 behaviour is kept), both on the memory store and fakeredis, and test_replayed_older_failure_keeps_the_blocks_latest_failure_time_across_instances on a real Redis. The simulator never crashes a process and its event times are monotonic, so the change cannot alter a recorded result; the reproduction check was rerun on 2.8.2.</w:t>
+        <w:t xml:space="preserve">Tests: test_replayed_older_failure_keeps_the_block_newest_time (the reviewer's two-send sequence) and test_newer_failure_after_a_replayed_old_one_raises_the_block_time (the other order), on the memory store and fakeredis, and test_replayed_older_failure_keeps_the_block_newest_time_across_instances on a real Redis. The first fails on 2.8.1, checked in a separate worktree at 1383589. The fifth-round test of the single-event case still passes.</w:t>
       </w:r>
     </w:p>
     <w:p>
@@ -570,7 +570,7 @@
         <w:spacing w:after="120"/>
       </w:pPr>
       <w:r>
-        <w:t xml:space="preserve">Section 4.2 says: 'Reputation counts and outage observations apply at the transition's time, a block keeping its latest failure time'. Section 6 lists the repair.</w:t>
+        <w:t xml:space="preserve">Section 4.2 says that 'a block keeps its latest outage failure time', and Section 6 lists the repair.</w:t>
       </w:r>
     </w:p>
     <w:p>
@@ -585,7 +585,7 @@
         <w:t xml:space="preserve">Where:</w:t>
       </w:r>
       <w:r>
-        <w:t xml:space="preserve"> store.py (zadd, gt); feedback.py (_outage_record); tests/unit/test_sixth_round.py; tests/integration/test_real_redis.py ([2.8.2 commit]). Manuscript Sections 4.2 and 6.</w:t>
+        <w:t xml:space="preserve"> store.py (zadd_max, LUA_ZADD_MAX); feedback.py (_outage_record); tests/unit/test_sixth_round.py; tests/integration/test_real_redis.py (b84e7f8). Manuscript Sections 4.2 and 6.</w:t>
       </w:r>
     </w:p>
     <w:p>
@@ -613,7 +613,7 @@
           <w:bCs/>
           <w:color w:val="1E6B3A"/>
         </w:rPr>
-        <w:t xml:space="preserve">Done: processing-time semantics chosen and documented</w:t>
+        <w:t xml:space="preserve">Fixed in 2.8.2 (b84e7f8): event-time semantics defined and tested</w:t>
       </w:r>
     </w:p>
     <w:p>
@@ -627,7 +627,7 @@
           <w:iCs/>
           <w:color w:val="444444"/>
         </w:rPr>
-        <w:t xml:space="preserve">Choose and document the intended semantics. If verdicts intentionally begin at processing time, narrow the manuscript and rebuttal while retaining event-time accounting for reputation and outage windows.</w:t>
+        <w:t xml:space="preserve">Choose and document the intended semantics ... If event-time equivalence is intended, implement and test timestamp-sensitive crossings, expiry and reordered arrivals. Do not merely pass a timestamp without defining how old and new events interact.</w:t>
       </w:r>
     </w:p>
     <w:p>
@@ -635,7 +635,7 @@
         <w:spacing w:after="120"/>
       </w:pPr>
       <w:r>
-        <w:t xml:space="preserve">We chose processing-time verdicts. A failure that reaches the block late is applied once, and a verdict it triggers starts when it is applied, with its full lifetime from then. A late observation can reasonably trigger action now, and replaying the block statistic at event time would need reordering rules we have not specified or tested. Section 4.2 now separates the components: 'each effect type applies at most once, and exactly once if the sweep runs within 20 minutes. Reputation counts and outage observations apply at the transition's time, a block keeping its latest failure time; block-test events apply when processed, so a verdict they trigger starts then.'</w:t>
+        <w:t xml:space="preserve">Reproduced on 2.8.1: the verdict was dated 600 seconds after its transition. In 2.8.2 _block_event receives the event's recorded time, and the semantics are defined at the top of feedback.py. An event counts toward the test that was running at its time; one dated before the block's last crossing belongs to a concluded test and is recorded, not counted, so it cannot cause a crossing. A crossing issues its verdict at the event's time, with the verdict's lifetime running from then, and escalates against the verdict active at that time. A reversal subtracts its failure only if that failure is dated at or after the block's last crossing. Block documents written by 2.8.1 are still read. On the live path the event's time is the clock's, so nothing changes there; what a replay can still differ in is when the operator learns of the verdict.</w:t>
       </w:r>
     </w:p>
     <w:p>
@@ -643,7 +643,23 @@
         <w:spacing w:after="120"/>
       </w:pPr>
       <w:r>
-        <w:t xml:space="preserve">feedback.py's module notes state the same, and test_replayed_failure_that_completes_a_crossing_starts_its_verdict_when_applied pins it ([2.8.2 commit]). In that test four failures are applied, the fifth transition dies before its effects, and recovery 600 seconds later applies it once. The verdict starts at the recovery time with the configured lifetime from then, and a second sweep changes nothing. We claim exactly-once application, not equivalence to timely processing.</w:t>
+        <w:t xml:space="preserve">Tests: test_replayed_crossing_is_dated_at_its_transition (the reviewer's case), test_replayed_crossing_escalates_against_the_verdict_active_at_its_time (expiry and escalation), test_event_dated_before_the_last_crossing_is_not_counted_in_the_next_test (reordered arrival), test_live_events_are_unchanged and test_old_documents_without_event_times_are_read, on the memory store and fakeredis, and test_replayed_crossing_is_dated_at_its_transition_across_instances on a real Redis. The four defect tests fail on 2.8.1 and pass on 2.8.2.</w:t>
+      </w:r>
+    </w:p>
+    <w:p>
+      <w:pPr>
+        <w:spacing w:after="120"/>
+      </w:pPr>
+      <w:r>
+        <w:t xml:space="preserve">Our own audit of 2.8.2 found one edge the reordering rules do not cover. A failure counted in a test that a replayed, earlier-dated event then concludes is dated after the crossing it preceded in processing. A late reversal of that failure therefore subtracts it from the new test (in our example the new statistic is −3.58 instead of −2.08). The repair is to record which test counted each failure; we have identified it and not yet made it, and the manuscript claims only what holds.</w:t>
+      </w:r>
+    </w:p>
+    <w:p>
+      <w:pPr>
+        <w:spacing w:after="120"/>
+      </w:pPr>
+      <w:r>
+        <w:t xml:space="preserve">Section 4.2 states what holds: each effect type applies at most once, and exactly once if the sweep runs within 20 minutes, 'at the transition's time: reputation counts land in its hour, a block keeps its latest outage failure time, and a verdict is dated at the event that triggers it.'</w:t>
       </w:r>
     </w:p>
     <w:p>
@@ -658,7 +674,7 @@
         <w:t xml:space="preserve">Where:</w:t>
       </w:r>
       <w:r>
-        <w:t xml:space="preserve"> feedback.py (module notes); tests/unit/test_sixth_round.py ([2.8.2 commit]). Manuscript Section 4.2.</w:t>
+        <w:t xml:space="preserve"> feedback.py (_apply, _block_event, module notes); tests/unit/test_sixth_round.py; tests/integration/test_real_redis.py (b84e7f8). Manuscript Section 4.2.</w:t>
       </w:r>
     </w:p>
     <w:p>
@@ -1134,7 +1150,7 @@
                 <w:sz w:val="18"/>
                 <w:szCs w:val="18"/>
               </w:rPr>
-              <w:t xml:space="preserve">A heuristic with constants from the configuration, not fitted, ordered the two policies correctly in 19 of 20 boundary cells: our tests leak about five messages a block plus those sent while early failures are unresolved, the counter its quota per block in every window, so it loses to paced pumpers and to wide, long campaigns.</w:t>
+              <w:t xml:space="preserve">A heuristic with constants from the configuration, not fitted, ordered the two policies correctly in all 18 boundary cells where its estimates differ: our tests leak about five messages a block plus those sent while early failures are unresolved, the counter its quota per block in every window, so it loses to paced pumpers and to wide, long campaigns.</w:t>
             </w:r>
           </w:p>
         </w:tc>
@@ -1318,7 +1334,7 @@
                 <w:sz w:val="18"/>
                 <w:szCs w:val="18"/>
               </w:rPr>
-              <w:t xml:space="preserve">… each effect type applies at most once, and exactly once if the sweep runs within 20 minutes. Reputation counts and outage observations apply at the transition's time, a block keeping its latest failure time; block-test events apply when processed, so a verdict they trigger starts then.</w:t>
+              <w:t xml:space="preserve">… each effect type applies at most once, and exactly once if the sweep runs within 20 minutes, at the transition's time: reputation counts land in its hour, a block keeps its latest outage failure time, and a verdict is dated at the event that triggers it. (2.8.2: M4, M5.)</w:t>
             </w:r>
           </w:p>
         </w:tc>
@@ -1962,7 +1978,7 @@
                 <w:sz w:val="18"/>
                 <w:szCs w:val="18"/>
               </w:rPr>
-              <w:t xml:space="preserve">… and a heuristic from Section 5 ordered the two in 19 of 20 boundary cells; a frozen counter failed its service claims when the attacker shares blocks with real users, and lost its advantage against wide, paced and trust-building pumpers.</w:t>
+              <w:t xml:space="preserve">… and a heuristic from Section 5 ordered the two in all 18 boundary cells where its estimates differ; a frozen counter failed its service claims when the attacker shares blocks with real users, and lost its advantage against wide, paced and trust-building pumpers.</w:t>
             </w:r>
           </w:p>
         </w:tc>
@@ -2891,7 +2907,7 @@
         <w:t xml:space="preserve">Independent check.</w:t>
       </w:r>
       <w:r>
-        <w:t xml:space="preserve"> No constant is fitted to the outcomes it predicts. τ comes from the configuration, and λ, N and B from each run's offered requests and requested blocks. With these inputs the predicted ordering matches the measured ordering in 19 of the 20 E4 security cells (3 to 300 blocks, 20 and 60 minutes, full-rate and paced), and the tie it misses is a cell where both estimates equal N. Equation 2 with the same τ was also checked on the main evaluation's spread study (18 configurations, seeds 0–9, different attack rates and range layouts), with errors of 1 to 13 % in the unsaturated configurations. What this does not show is transfer to real traffic: both studies run in one simulator, and the paper says the heuristic is a summary under stated assumptions for operators to check against their own timeouts, rates and block loads.</w:t>
+        <w:t xml:space="preserve"> No constant is fitted to the outcomes it predicts. τ comes from the configuration, and λ, N and B from each run's offered requests and requested blocks. With these inputs the predicted ordering matches the measured ordering in all 18 E4 security cells where the two estimates differ (3 to 300 blocks, 20 and 60 minutes, full-rate and paced); in the remaining two, both estimates equal N and the heuristic predicts nothing. Equation 2 with the same configured timings was also checked on the main evaluation's spread study (18 configurations, seeds 0–9, different attack rates and range layouts), with errors of 3 to 7 % for its never-verifying pumpers. What this does not show is transfer to real traffic: both studies run in one simulator, and the paper says the heuristic is a summary under stated assumptions for operators to check against their own timeouts, rates and block loads.</w:t>
       </w:r>
     </w:p>
     <w:p>
@@ -3045,7 +3061,7 @@
                 <w:sz w:val="18"/>
                 <w:szCs w:val="18"/>
               </w:rPr>
-              <w:t xml:space="preserve">Reproduced on 2.8.1 (score 900 → 0; zero blocks at 1,801 s). Fixed in 2.8.2: one block in the window; regression tests on the memory store, fakeredis and a real Redis ([2.8.2 commit]).</w:t>
+              <w:t xml:space="preserve">Reproduced on 2.8.1 (score 900 → 0; zero blocks at 1,801 s). Fixed in 2.8.2 (b84e7f8): the block stays in the window; tests on the memory store, fakeredis and a real Redis.</w:t>
             </w:r>
           </w:p>
         </w:tc>
@@ -3108,7 +3124,7 @@
                 <w:sz w:val="18"/>
                 <w:szCs w:val="18"/>
               </w:rPr>
-              <w:t xml:space="preserve">Reproduced; kept by design as processing-time semantics, documented and pinned by a test (M5).</w:t>
+              <w:t xml:space="preserve">Reproduced on 2.8.1 (verdict dated 600 s after its transition). Fixed in 2.8.2: the verdict is dated at the transition, escalation and reordering have defined rules, and each is tested (M5).</w:t>
             </w:r>
           </w:p>
         </w:tc>
@@ -3297,7 +3313,7 @@
                 <w:sz w:val="18"/>
                 <w:szCs w:val="18"/>
               </w:rPr>
-              <w:t xml:space="preserve">The simulator never crashes a process and its event times are monotonic, so 2.8.2 cannot change a recorded run; scripts/check_reproduction.py was rerun on 2.8.2.</w:t>
+              <w:t xml:space="preserve">scripts/check_reproduction.py with 2.8.2: 102 of 102 sampled runs identical. The full suite: 434 tests pass, eighteen across two instances on a real Redis (results/test_report.txt). Checking this found the store-expiry difference reported above, which we disclose and have not changed.</w:t>
             </w:r>
           </w:p>
         </w:tc>
@@ -3521,7 +3537,7 @@
                 <w:sz w:val="18"/>
                 <w:szCs w:val="18"/>
               </w:rPr>
-              <w:t xml:space="preserve">Section 5 rewritten as a heuristic with one estimand, actual windows, a bound, and constants not fitted; ordering checked in 19 of 20 E4 cells (M1–M3).</w:t>
+              <w:t xml:space="preserve">Section 5 rewritten as a heuristic with one estimand, actual windows, a bound, and constants not fitted; ordering checked in all 18 E4 cells where the estimates differ (M1–M3).</w:t>
             </w:r>
           </w:p>
         </w:tc>
@@ -3613,7 +3629,7 @@
                 <w:sz w:val="18"/>
                 <w:szCs w:val="18"/>
               </w:rPr>
-              <w:t xml:space="preserve">Same-block reordering fixed in 2.8.2 (M4); verdict timing documented as processing time and the guarantee narrowed (M5).</w:t>
+              <w:t xml:space="preserve">Same-block reordering fixed (M4) and block-test events, verdicts and escalation dated at the transition's time (M5), both in 2.8.2 with tests that fail on 2.8.1.</w:t>
             </w:r>
           </w:p>
         </w:tc>

</xml_diff>

<commit_message>
2.8.3: reversal subtracts only within the test that counted the failure; checksums and headline entries
- feedback._block_event records with every counted event the number of the
  test that counted it; a reversal subtracts its failure only when that is
  the test now running. Closes the edge found after 2.8.2 (a failure counted
  before a replayed, earlier-dated crossing was reversed against the next
  test). Entries written by 2.8.2 keep the event-time rule. Regression test
  fails on 2.8.2; 436 tests pass; 102 recorded runs replayed with 2.8.3 are
  identical.
- CHANGELOG, docs/evaluation.md, feedback.py notes and the round-6 letter
  (rebuilt docx) say the edge is fixed; README test counts 436 / eighteen.
- results/CHECKSUMS.sha256 over results/*.json and *.jsonl.gz for the
  release; headline map reads condition_check.json (18 of 18 decisive cells;
  105/139/240 against 110/144/242).
- Version 2.8.3.
</commit_message>
<xml_diff>
--- a/paper/rebuttal_round6.docx
+++ b/paper/rebuttal_round6.docx
@@ -651,7 +651,7 @@
         <w:spacing w:after="120"/>
       </w:pPr>
       <w:r>
-        <w:t xml:space="preserve">Our own audit of 2.8.2 found one edge the reordering rules do not cover. A failure counted in a test that a replayed, earlier-dated event then concludes is dated after the crossing it preceded in processing. A late reversal of that failure therefore subtracts it from the new test (in our example the new statistic is −3.58 instead of −2.08). The repair is to record which test counted each failure; we have identified it and not yet made it, and the manuscript claims only what holds.</w:t>
+        <w:t xml:space="preserve">Our own audit of 2.8.2 found one edge the reordering rules did not cover. A failure counted in a test that a replayed, earlier-dated event then concludes is dated after the crossing it preceded in processing. A late reversal of that failure therefore subtracted it from the new test (in our example the new statistic was −3.58 instead of −2.08). Release 2.8.3 (tag v2.8.3) fixes it: every counted event is recorded with the number of the test that counted it, and a reversal subtracts its failure only within that test. The regression test test_reversal_of_a_failure_the_concluded_test_counted_leaves_the_next_test fails on 2.8.2 and passes on 2.8.3; the live path is unchanged and the 102-run reproduction check is identical.</w:t>
       </w:r>
     </w:p>
     <w:p>
@@ -1065,7 +1065,7 @@
       </w:tr>
       <w:tr>
         <w:trPr>
-          <w:tblHeader w:val="false"/>
+          <w:tblHeader w:val="off"/>
         </w:trPr>
         <w:tc>
           <w:tcPr>
@@ -1157,7 +1157,7 @@
       </w:tr>
       <w:tr>
         <w:trPr>
-          <w:tblHeader w:val="false"/>
+          <w:tblHeader w:val="off"/>
         </w:trPr>
         <w:tc>
           <w:tcPr>
@@ -1249,7 +1249,7 @@
       </w:tr>
       <w:tr>
         <w:trPr>
-          <w:tblHeader w:val="false"/>
+          <w:tblHeader w:val="off"/>
         </w:trPr>
         <w:tc>
           <w:tcPr>
@@ -1341,7 +1341,7 @@
       </w:tr>
       <w:tr>
         <w:trPr>
-          <w:tblHeader w:val="false"/>
+          <w:tblHeader w:val="off"/>
         </w:trPr>
         <w:tc>
           <w:tcPr>
@@ -1433,7 +1433,7 @@
       </w:tr>
       <w:tr>
         <w:trPr>
-          <w:tblHeader w:val="false"/>
+          <w:tblHeader w:val="off"/>
         </w:trPr>
         <w:tc>
           <w:tcPr>
@@ -1525,7 +1525,7 @@
       </w:tr>
       <w:tr>
         <w:trPr>
-          <w:tblHeader w:val="false"/>
+          <w:tblHeader w:val="off"/>
         </w:trPr>
         <w:tc>
           <w:tcPr>
@@ -1617,7 +1617,7 @@
       </w:tr>
       <w:tr>
         <w:trPr>
-          <w:tblHeader w:val="false"/>
+          <w:tblHeader w:val="off"/>
         </w:trPr>
         <w:tc>
           <w:tcPr>
@@ -1709,7 +1709,7 @@
       </w:tr>
       <w:tr>
         <w:trPr>
-          <w:tblHeader w:val="false"/>
+          <w:tblHeader w:val="off"/>
         </w:trPr>
         <w:tc>
           <w:tcPr>
@@ -1801,7 +1801,7 @@
       </w:tr>
       <w:tr>
         <w:trPr>
-          <w:tblHeader w:val="false"/>
+          <w:tblHeader w:val="off"/>
         </w:trPr>
         <w:tc>
           <w:tcPr>
@@ -1893,7 +1893,7 @@
       </w:tr>
       <w:tr>
         <w:trPr>
-          <w:tblHeader w:val="false"/>
+          <w:tblHeader w:val="off"/>
         </w:trPr>
         <w:tc>
           <w:tcPr>
@@ -2368,7 +2368,7 @@
       </w:tr>
       <w:tr>
         <w:trPr>
-          <w:tblHeader w:val="false"/>
+          <w:tblHeader w:val="off"/>
         </w:trPr>
         <w:tc>
           <w:tcPr>
@@ -2431,7 +2431,7 @@
       </w:tr>
       <w:tr>
         <w:trPr>
-          <w:tblHeader w:val="false"/>
+          <w:tblHeader w:val="off"/>
         </w:trPr>
         <w:tc>
           <w:tcPr>
@@ -2494,7 +2494,7 @@
       </w:tr>
       <w:tr>
         <w:trPr>
-          <w:tblHeader w:val="false"/>
+          <w:tblHeader w:val="off"/>
         </w:trPr>
         <w:tc>
           <w:tcPr>
@@ -2557,7 +2557,7 @@
       </w:tr>
       <w:tr>
         <w:trPr>
-          <w:tblHeader w:val="false"/>
+          <w:tblHeader w:val="off"/>
         </w:trPr>
         <w:tc>
           <w:tcPr>
@@ -2620,7 +2620,7 @@
       </w:tr>
       <w:tr>
         <w:trPr>
-          <w:tblHeader w:val="false"/>
+          <w:tblHeader w:val="off"/>
         </w:trPr>
         <w:tc>
           <w:tcPr>
@@ -2683,7 +2683,7 @@
       </w:tr>
       <w:tr>
         <w:trPr>
-          <w:tblHeader w:val="false"/>
+          <w:tblHeader w:val="off"/>
         </w:trPr>
         <w:tc>
           <w:tcPr>
@@ -2746,7 +2746,7 @@
       </w:tr>
       <w:tr>
         <w:trPr>
-          <w:tblHeader w:val="false"/>
+          <w:tblHeader w:val="off"/>
         </w:trPr>
         <w:tc>
           <w:tcPr>
@@ -3005,7 +3005,7 @@
       </w:tr>
       <w:tr>
         <w:trPr>
-          <w:tblHeader w:val="false"/>
+          <w:tblHeader w:val="off"/>
         </w:trPr>
         <w:tc>
           <w:tcPr>
@@ -3068,7 +3068,7 @@
       </w:tr>
       <w:tr>
         <w:trPr>
-          <w:tblHeader w:val="false"/>
+          <w:tblHeader w:val="off"/>
         </w:trPr>
         <w:tc>
           <w:tcPr>
@@ -3131,7 +3131,7 @@
       </w:tr>
       <w:tr>
         <w:trPr>
-          <w:tblHeader w:val="false"/>
+          <w:tblHeader w:val="off"/>
         </w:trPr>
         <w:tc>
           <w:tcPr>
@@ -3194,7 +3194,7 @@
       </w:tr>
       <w:tr>
         <w:trPr>
-          <w:tblHeader w:val="false"/>
+          <w:tblHeader w:val="off"/>
         </w:trPr>
         <w:tc>
           <w:tcPr>
@@ -3257,7 +3257,7 @@
       </w:tr>
       <w:tr>
         <w:trPr>
-          <w:tblHeader w:val="false"/>
+          <w:tblHeader w:val="off"/>
         </w:trPr>
         <w:tc>
           <w:tcPr>
@@ -3452,7 +3452,7 @@
       </w:tr>
       <w:tr>
         <w:trPr>
-          <w:tblHeader w:val="false"/>
+          <w:tblHeader w:val="off"/>
         </w:trPr>
         <w:tc>
           <w:tcPr>
@@ -3544,7 +3544,7 @@
       </w:tr>
       <w:tr>
         <w:trPr>
-          <w:tblHeader w:val="false"/>
+          <w:tblHeader w:val="off"/>
         </w:trPr>
         <w:tc>
           <w:tcPr>
@@ -3636,7 +3636,7 @@
       </w:tr>
       <w:tr>
         <w:trPr>
-          <w:tblHeader w:val="false"/>
+          <w:tblHeader w:val="off"/>
         </w:trPr>
         <w:tc>
           <w:tcPr>
@@ -3728,7 +3728,7 @@
       </w:tr>
       <w:tr>
         <w:trPr>
-          <w:tblHeader w:val="false"/>
+          <w:tblHeader w:val="off"/>
         </w:trPr>
         <w:tc>
           <w:tcPr>
@@ -3820,7 +3820,7 @@
       </w:tr>
       <w:tr>
         <w:trPr>
-          <w:tblHeader w:val="false"/>
+          <w:tblHeader w:val="off"/>
         </w:trPr>
         <w:tc>
           <w:tcPr>
@@ -3912,7 +3912,7 @@
       </w:tr>
       <w:tr>
         <w:trPr>
-          <w:tblHeader w:val="false"/>
+          <w:tblHeader w:val="off"/>
         </w:trPr>
         <w:tc>
           <w:tcPr>
@@ -4004,7 +4004,7 @@
       </w:tr>
       <w:tr>
         <w:trPr>
-          <w:tblHeader w:val="false"/>
+          <w:tblHeader w:val="off"/>
         </w:trPr>
         <w:tc>
           <w:tcPr>
@@ -4096,7 +4096,7 @@
       </w:tr>
       <w:tr>
         <w:trPr>
-          <w:tblHeader w:val="false"/>
+          <w:tblHeader w:val="off"/>
         </w:trPr>
         <w:tc>
           <w:tcPr>
@@ -4201,7 +4201,7 @@
       </w:r>
     </w:p>
     <w:sectPr>
-      <w:footerReference w:type="default" r:id="rId7"/>
+      <w:footerReference w:type="default" r:id="rId6"/>
       <w:pgSz w:w="11906" w:h="16838" w:orient="portrait"/>
       <w:pgMar w:top="1250" w:right="1300" w:bottom="1250" w:left="1300" w:header="708" w:footer="708" w:gutter="0"/>
       <w:pgNumType/>
@@ -4209,10 +4209,6 @@
     </w:sectPr>
   </w:body>
 </w:document>
-</file>
-
-<file path=word/comments.xml><?xml version="1.0" encoding="utf-8"?>
-<w:comments xmlns:cx="http://schemas.microsoft.com/office/drawing/2014/chartex" xmlns:cx1="http://schemas.microsoft.com/office/drawing/2015/9/8/chartex" xmlns:cx2="http://schemas.microsoft.com/office/drawing/2015/10/21/chartex" xmlns:cx3="http://schemas.microsoft.com/office/drawing/2016/5/9/chartex" xmlns:cx4="http://schemas.microsoft.com/office/drawing/2016/5/10/chartex" xmlns:cx5="http://schemas.microsoft.com/office/drawing/2016/5/11/chartex" xmlns:cx6="http://schemas.microsoft.com/office/drawing/2016/5/12/chartex" xmlns:cx7="http://schemas.microsoft.com/office/drawing/2016/5/13/chartex" xmlns:cx8="http://schemas.microsoft.com/office/drawing/2016/5/14/chartex" xmlns:mc="http://schemas.openxmlformats.org/markup-compatibility/2006" xmlns:aink="http://schemas.microsoft.com/office/drawing/2016/ink" xmlns:am3d="http://schemas.microsoft.com/office/drawing/2017/model3d" xmlns:o="urn:schemas-microsoft-com:office:office" xmlns:r="http://schemas.openxmlformats.org/officeDocument/2006/relationships" xmlns:m="http://schemas.openxmlformats.org/officeDocument/2006/math" xmlns:v="urn:schemas-microsoft-com:vml" xmlns:wp14="http://schemas.microsoft.com/office/word/2010/wordprocessingDrawing" xmlns:wp="http://schemas.openxmlformats.org/drawingml/2006/wordprocessingDrawing" xmlns:w10="urn:schemas-microsoft-com:office:word" xmlns:w="http://schemas.openxmlformats.org/wordprocessingml/2006/main" xmlns:w14="http://schemas.microsoft.com/office/word/2010/wordml" xmlns:w15="http://schemas.microsoft.com/office/word/2012/wordml" xmlns:w16cex="http://schemas.microsoft.com/office/word/2018/wordml/cex" xmlns:w16cid="http://schemas.microsoft.com/office/word/2016/wordml/cid" xmlns:w16="http://schemas.microsoft.com/office/word/2018/wordml" xmlns:w16sdtdh="http://schemas.microsoft.com/office/word/2020/wordml/sdtdatahash" xmlns:w16se="http://schemas.microsoft.com/office/word/2015/wordml/symex" xmlns:wpg="http://schemas.microsoft.com/office/word/2010/wordprocessingGroup" xmlns:wpi="http://schemas.microsoft.com/office/word/2010/wordprocessingInk" xmlns:wne="http://schemas.microsoft.com/office/word/2006/wordml" xmlns:wps="http://schemas.microsoft.com/office/word/2010/wordprocessingShape"/>
 </file>
 
 <file path=word/endnotes.xml><?xml version="1.0" encoding="utf-8"?>
@@ -4314,7 +4310,7 @@
 <w:numbering xmlns:wpc="http://schemas.microsoft.com/office/word/2010/wordprocessingCanvas" xmlns:mc="http://schemas.openxmlformats.org/markup-compatibility/2006" xmlns:o="urn:schemas-microsoft-com:office:office" xmlns:r="http://schemas.openxmlformats.org/officeDocument/2006/relationships" xmlns:m="http://schemas.openxmlformats.org/officeDocument/2006/math" xmlns:v="urn:schemas-microsoft-com:vml" xmlns:wp14="http://schemas.microsoft.com/office/word/2010/wordprocessingDrawing" xmlns:wp="http://schemas.openxmlformats.org/drawingml/2006/wordprocessingDrawing" xmlns:w10="urn:schemas-microsoft-com:office:word" xmlns:w="http://schemas.openxmlformats.org/wordprocessingml/2006/main" xmlns:w14="http://schemas.microsoft.com/office/word/2010/wordml" xmlns:w15="http://schemas.microsoft.com/office/word/2012/wordml" xmlns:wpg="http://schemas.microsoft.com/office/word/2010/wordprocessingGroup" xmlns:wpi="http://schemas.microsoft.com/office/word/2010/wordprocessingInk" xmlns:wne="http://schemas.microsoft.com/office/word/2006/wordml" xmlns:wps="http://schemas.microsoft.com/office/word/2010/wordprocessingShape" mc:Ignorable="w14 w15 wp14">
   <w:abstractNum w:abstractNumId="1" w15:restartNumberingAfterBreak="0">
     <w:multiLevelType w:val="hybridMultilevel"/>
-    <w:lvl w:ilvl="0" w15:tentative="1">
+    <w:lvl w:ilvl="0" w:tentative="1">
       <w:start w:val="1"/>
       <w:numFmt w:val="bullet"/>
       <w:lvlText w:val="●"/>
@@ -4323,7 +4319,7 @@
         <w:ind w:left="720" w:hanging="360"/>
       </w:pPr>
     </w:lvl>
-    <w:lvl w:ilvl="1" w15:tentative="1">
+    <w:lvl w:ilvl="1" w:tentative="1">
       <w:start w:val="1"/>
       <w:numFmt w:val="bullet"/>
       <w:lvlText w:val="○"/>
@@ -4332,7 +4328,7 @@
         <w:ind w:left="1440" w:hanging="360"/>
       </w:pPr>
     </w:lvl>
-    <w:lvl w:ilvl="2" w15:tentative="1">
+    <w:lvl w:ilvl="2" w:tentative="1">
       <w:start w:val="1"/>
       <w:numFmt w:val="bullet"/>
       <w:lvlText w:val="■"/>
@@ -4341,7 +4337,7 @@
         <w:ind w:left="2160" w:hanging="360"/>
       </w:pPr>
     </w:lvl>
-    <w:lvl w:ilvl="3" w15:tentative="1">
+    <w:lvl w:ilvl="3" w:tentative="1">
       <w:start w:val="1"/>
       <w:numFmt w:val="bullet"/>
       <w:lvlText w:val="●"/>
@@ -4350,7 +4346,7 @@
         <w:ind w:left="2880" w:hanging="360"/>
       </w:pPr>
     </w:lvl>
-    <w:lvl w:ilvl="4" w15:tentative="1">
+    <w:lvl w:ilvl="4" w:tentative="1">
       <w:start w:val="1"/>
       <w:numFmt w:val="bullet"/>
       <w:lvlText w:val="○"/>
@@ -4359,7 +4355,7 @@
         <w:ind w:left="3600" w:hanging="360"/>
       </w:pPr>
     </w:lvl>
-    <w:lvl w:ilvl="5" w15:tentative="1">
+    <w:lvl w:ilvl="5" w:tentative="1">
       <w:start w:val="1"/>
       <w:numFmt w:val="bullet"/>
       <w:lvlText w:val="■"/>
@@ -4368,7 +4364,7 @@
         <w:ind w:left="4320" w:hanging="360"/>
       </w:pPr>
     </w:lvl>
-    <w:lvl w:ilvl="6" w15:tentative="1">
+    <w:lvl w:ilvl="6" w:tentative="1">
       <w:start w:val="1"/>
       <w:numFmt w:val="bullet"/>
       <w:lvlText w:val="●"/>
@@ -4377,7 +4373,7 @@
         <w:ind w:left="5040" w:hanging="360"/>
       </w:pPr>
     </w:lvl>
-    <w:lvl w:ilvl="7" w15:tentative="1">
+    <w:lvl w:ilvl="7" w:tentative="1">
       <w:start w:val="1"/>
       <w:numFmt w:val="bullet"/>
       <w:lvlText w:val="●"/>
@@ -4386,7 +4382,7 @@
         <w:ind w:left="5760" w:hanging="360"/>
       </w:pPr>
     </w:lvl>
-    <w:lvl w:ilvl="8" w15:tentative="1">
+    <w:lvl w:ilvl="8" w:tentative="1">
       <w:start w:val="1"/>
       <w:numFmt w:val="bullet"/>
       <w:lvlText w:val="●"/>
@@ -4398,7 +4394,7 @@
   </w:abstractNum>
   <w:abstractNum w:abstractNumId="2" w15:restartNumberingAfterBreak="0">
     <w:multiLevelType w:val="hybridMultilevel"/>
-    <w:lvl w:ilvl="0" w15:tentative="1">
+    <w:lvl w:ilvl="0" w:tentative="1">
       <w:start w:val="1"/>
       <w:numFmt w:val="bullet"/>
       <w:lvlText w:val="•"/>
@@ -4435,6 +4431,10 @@
     </w:rPrDefault>
     <w:pPrDefault/>
   </w:docDefaults>
+  <w:style w:type="paragraph" w:styleId="Normal" w:default="1">
+    <w:name w:val="Normal"/>
+    <w:qFormat/>
+  </w:style>
   <w:style w:type="paragraph" w:styleId="Title">
     <w:name w:val="Title"/>
     <w:basedOn w:val="Normal"/>
@@ -4443,28 +4443,6 @@
     <w:rPr>
       <w:sz w:val="56"/>
       <w:szCs w:val="56"/>
-    </w:rPr>
-  </w:style>
-  <w:style w:type="paragraph" w:styleId="Heading1">
-    <w:name w:val="Heading 1"/>
-    <w:basedOn w:val="Normal"/>
-    <w:next w:val="Normal"/>
-    <w:qFormat/>
-    <w:rPr>
-      <w:color w:val="2E74B5"/>
-      <w:sz w:val="32"/>
-      <w:szCs w:val="32"/>
-    </w:rPr>
-  </w:style>
-  <w:style w:type="paragraph" w:styleId="Heading2">
-    <w:name w:val="Heading 2"/>
-    <w:basedOn w:val="Normal"/>
-    <w:next w:val="Normal"/>
-    <w:qFormat/>
-    <w:rPr>
-      <w:color w:val="2E74B5"/>
-      <w:sz w:val="26"/>
-      <w:szCs w:val="26"/>
     </w:rPr>
   </w:style>
   <w:style w:type="paragraph" w:styleId="Heading3">
@@ -4641,4 +4619,294 @@
     </w:rPr>
   </w:style>
 </w:styles>
+</file>
+
+<file path=word/theme/theme1.xml><?xml version="1.0" encoding="utf-8"?>
+<a:theme xmlns:a="http://schemas.openxmlformats.org/drawingml/2006/main" name="Office Theme">
+  <a:themeElements>
+    <a:clrScheme name="Office">
+      <a:dk1>
+        <a:sysClr val="windowText" lastClr="000000"/>
+      </a:dk1>
+      <a:lt1>
+        <a:sysClr val="window" lastClr="FFFFFF"/>
+      </a:lt1>
+      <a:dk2>
+        <a:srgbClr val="44546A"/>
+      </a:dk2>
+      <a:lt2>
+        <a:srgbClr val="E7E6E6"/>
+      </a:lt2>
+      <a:accent1>
+        <a:srgbClr val="4472C4"/>
+      </a:accent1>
+      <a:accent2>
+        <a:srgbClr val="ED7D31"/>
+      </a:accent2>
+      <a:accent3>
+        <a:srgbClr val="A5A5A5"/>
+      </a:accent3>
+      <a:accent4>
+        <a:srgbClr val="FFC000"/>
+      </a:accent4>
+      <a:accent5>
+        <a:srgbClr val="5B9BD5"/>
+      </a:accent5>
+      <a:accent6>
+        <a:srgbClr val="70AD47"/>
+      </a:accent6>
+      <a:hlink>
+        <a:srgbClr val="0563C1"/>
+      </a:hlink>
+      <a:folHlink>
+        <a:srgbClr val="954F72"/>
+      </a:folHlink>
+    </a:clrScheme>
+    <a:fontScheme name="Office">
+      <a:majorFont>
+        <a:latin typeface="Calibri Light" panose="020F0302020204030204"/>
+        <a:ea typeface=""/>
+        <a:cs typeface=""/>
+        <a:font script="Jpan" typeface="游ゴシック Light"/>
+        <a:font script="Hang" typeface="맑은 고딕"/>
+        <a:font script="Hans" typeface="等线 Light"/>
+        <a:font script="Hant" typeface="新細明體"/>
+        <a:font script="Arab" typeface="Times New Roman"/>
+        <a:font script="Hebr" typeface="Times New Roman"/>
+        <a:font script="Thai" typeface="Angsana New"/>
+        <a:font script="Ethi" typeface="Nyala"/>
+        <a:font script="Beng" typeface="Vrinda"/>
+        <a:font script="Gujr" typeface="Shruti"/>
+        <a:font script="Khmr" typeface="MoolBoran"/>
+        <a:font script="Knda" typeface="Tunga"/>
+        <a:font script="Guru" typeface="Raavi"/>
+        <a:font script="Cans" typeface="Euphemia"/>
+        <a:font script="Cher" typeface="Plantagenet Cherokee"/>
+        <a:font script="Yiii" typeface="Microsoft Yi Baiti"/>
+        <a:font script="Tibt" typeface="Microsoft Himalaya"/>
+        <a:font script="Thaa" typeface="MV Boli"/>
+        <a:font script="Deva" typeface="Mangal"/>
+        <a:font script="Telu" typeface="Gautami"/>
+        <a:font script="Taml" typeface="Latha"/>
+        <a:font script="Syrc" typeface="Estrangelo Edessa"/>
+        <a:font script="Orya" typeface="Kalinga"/>
+        <a:font script="Mlym" typeface="Kartika"/>
+        <a:font script="Laoo" typeface="DokChampa"/>
+        <a:font script="Sinh" typeface="Iskoola Pota"/>
+        <a:font script="Mong" typeface="Mongolian Baiti"/>
+        <a:font script="Viet" typeface="Times New Roman"/>
+        <a:font script="Uigh" typeface="Microsoft Uighur"/>
+        <a:font script="Geor" typeface="Sylfaen"/>
+        <a:font script="Armn" typeface="Arial"/>
+        <a:font script="Bugi" typeface="Leelawadee UI"/>
+        <a:font script="Bopo" typeface="Microsoft JhengHei"/>
+        <a:font script="Java" typeface="Javanese Text"/>
+        <a:font script="Lisu" typeface="Segoe UI"/>
+        <a:font script="Mymr" typeface="Myanmar Text"/>
+        <a:font script="Nkoo" typeface="Ebrima"/>
+        <a:font script="Olck" typeface="Nirmala UI"/>
+        <a:font script="Osma" typeface="Ebrima"/>
+        <a:font script="Phag" typeface="Phagspa"/>
+        <a:font script="Syrn" typeface="Estrangelo Edessa"/>
+        <a:font script="Syrj" typeface="Estrangelo Edessa"/>
+        <a:font script="Syre" typeface="Estrangelo Edessa"/>
+        <a:font script="Sora" typeface="Nirmala UI"/>
+        <a:font script="Tale" typeface="Microsoft Tai Le"/>
+        <a:font script="Talu" typeface="Microsoft New Tai Lue"/>
+        <a:font script="Tfng" typeface="Ebrima"/>
+      </a:majorFont>
+      <a:minorFont>
+        <a:latin typeface="Calibri" panose="020F0502020204030204"/>
+        <a:ea typeface=""/>
+        <a:cs typeface=""/>
+        <a:font script="Jpan" typeface="游明朝"/>
+        <a:font script="Hang" typeface="맑은 고딕"/>
+        <a:font script="Hans" typeface="等线"/>
+        <a:font script="Hant" typeface="新細明體"/>
+        <a:font script="Arab" typeface="Arial"/>
+        <a:font script="Hebr" typeface="Arial"/>
+        <a:font script="Thai" typeface="Cordia New"/>
+        <a:font script="Ethi" typeface="Nyala"/>
+        <a:font script="Beng" typeface="Vrinda"/>
+        <a:font script="Gujr" typeface="Shruti"/>
+        <a:font script="Khmr" typeface="DaunPenh"/>
+        <a:font script="Knda" typeface="Tunga"/>
+        <a:font script="Guru" typeface="Raavi"/>
+        <a:font script="Cans" typeface="Euphemia"/>
+        <a:font script="Cher" typeface="Plantagenet Cherokee"/>
+        <a:font script="Yiii" typeface="Microsoft Yi Baiti"/>
+        <a:font script="Tibt" typeface="Microsoft Himalaya"/>
+        <a:font script="Thaa" typeface="MV Boli"/>
+        <a:font script="Deva" typeface="Mangal"/>
+        <a:font script="Telu" typeface="Gautami"/>
+        <a:font script="Taml" typeface="Latha"/>
+        <a:font script="Syrc" typeface="Estrangelo Edessa"/>
+        <a:font script="Orya" typeface="Kalinga"/>
+        <a:font script="Mlym" typeface="Kartika"/>
+        <a:font script="Laoo" typeface="DokChampa"/>
+        <a:font script="Sinh" typeface="Iskoola Pota"/>
+        <a:font script="Mong" typeface="Mongolian Baiti"/>
+        <a:font script="Viet" typeface="Arial"/>
+        <a:font script="Uigh" typeface="Microsoft Uighur"/>
+        <a:font script="Geor" typeface="Sylfaen"/>
+        <a:font script="Armn" typeface="Arial"/>
+        <a:font script="Bugi" typeface="Leelawadee UI"/>
+        <a:font script="Bopo" typeface="Microsoft JhengHei"/>
+        <a:font script="Java" typeface="Javanese Text"/>
+        <a:font script="Lisu" typeface="Segoe UI"/>
+        <a:font script="Mymr" typeface="Myanmar Text"/>
+        <a:font script="Nkoo" typeface="Ebrima"/>
+        <a:font script="Olck" typeface="Nirmala UI"/>
+        <a:font script="Osma" typeface="Ebrima"/>
+        <a:font script="Phag" typeface="Phagspa"/>
+        <a:font script="Syrn" typeface="Estrangelo Edessa"/>
+        <a:font script="Syrj" typeface="Estrangelo Edessa"/>
+        <a:font script="Syre" typeface="Estrangelo Edessa"/>
+        <a:font script="Sora" typeface="Nirmala UI"/>
+        <a:font script="Tale" typeface="Microsoft Tai Le"/>
+        <a:font script="Talu" typeface="Microsoft New Tai Lue"/>
+        <a:font script="Tfng" typeface="Ebrima"/>
+      </a:minorFont>
+    </a:fontScheme>
+    <a:fmtScheme name="Office">
+      <a:fillStyleLst>
+        <a:solidFill>
+          <a:schemeClr val="phClr"/>
+        </a:solidFill>
+        <a:gradFill rotWithShape="true">
+          <a:gsLst>
+            <a:gs pos="0">
+              <a:schemeClr val="phClr">
+                <a:lumMod val="110000"/>
+                <a:satMod val="105000"/>
+                <a:tint val="67000"/>
+              </a:schemeClr>
+            </a:gs>
+            <a:gs pos="50000">
+              <a:schemeClr val="phClr">
+                <a:lumMod val="105000"/>
+                <a:satMod val="103000"/>
+                <a:tint val="73000"/>
+              </a:schemeClr>
+            </a:gs>
+            <a:gs pos="100000">
+              <a:schemeClr val="phClr">
+                <a:lumMod val="105000"/>
+                <a:satMod val="109000"/>
+                <a:tint val="81000"/>
+              </a:schemeClr>
+            </a:gs>
+          </a:gsLst>
+          <a:lin ang="5400000" scaled="false"/>
+        </a:gradFill>
+        <a:gradFill rotWithShape="true">
+          <a:gsLst>
+            <a:gs pos="0">
+              <a:schemeClr val="phClr">
+                <a:satMod val="103000"/>
+                <a:lumMod val="102000"/>
+                <a:tint val="94000"/>
+              </a:schemeClr>
+            </a:gs>
+            <a:gs pos="50000">
+              <a:schemeClr val="phClr">
+                <a:satMod val="110000"/>
+                <a:lumMod val="100000"/>
+                <a:shade val="100000"/>
+              </a:schemeClr>
+            </a:gs>
+            <a:gs pos="100000">
+              <a:schemeClr val="phClr">
+                <a:lumMod val="99000"/>
+                <a:satMod val="120000"/>
+                <a:shade val="78000"/>
+              </a:schemeClr>
+            </a:gs>
+          </a:gsLst>
+          <a:lin ang="5400000" scaled="false"/>
+        </a:gradFill>
+      </a:fillStyleLst>
+      <a:lnStyleLst>
+        <a:ln w="6350" cap="flat" cmpd="sng" algn="ctr">
+          <a:solidFill>
+            <a:schemeClr val="phClr"/>
+          </a:solidFill>
+          <a:prstDash val="solid"/>
+          <a:miter lim="800000"/>
+        </a:ln>
+        <a:ln w="12700" cap="flat" cmpd="sng" algn="ctr">
+          <a:solidFill>
+            <a:schemeClr val="phClr"/>
+          </a:solidFill>
+          <a:prstDash val="solid"/>
+          <a:miter lim="800000"/>
+        </a:ln>
+        <a:ln w="19050" cap="flat" cmpd="sng" algn="ctr">
+          <a:solidFill>
+            <a:schemeClr val="phClr"/>
+          </a:solidFill>
+          <a:prstDash val="solid"/>
+          <a:miter lim="800000"/>
+        </a:ln>
+      </a:lnStyleLst>
+      <a:effectStyleLst>
+        <a:effectStyle>
+          <a:effectLst/>
+        </a:effectStyle>
+        <a:effectStyle>
+          <a:effectLst/>
+        </a:effectStyle>
+        <a:effectStyle>
+          <a:effectLst>
+            <a:outerShdw blurRad="57150" dist="19050" dir="5400000" algn="ctr" rotWithShape="false">
+              <a:srgbClr val="000000">
+                <a:alpha val="63000"/>
+              </a:srgbClr>
+            </a:outerShdw>
+          </a:effectLst>
+        </a:effectStyle>
+      </a:effectStyleLst>
+      <a:bgFillStyleLst>
+        <a:solidFill>
+          <a:schemeClr val="phClr"/>
+        </a:solidFill>
+        <a:solidFill>
+          <a:schemeClr val="phClr">
+            <a:tint val="95000"/>
+            <a:satMod val="170000"/>
+          </a:schemeClr>
+        </a:solidFill>
+        <a:gradFill rotWithShape="true">
+          <a:gsLst>
+            <a:gs pos="0">
+              <a:schemeClr val="phClr">
+                <a:tint val="93000"/>
+                <a:satMod val="150000"/>
+                <a:shade val="98000"/>
+                <a:lumMod val="102000"/>
+              </a:schemeClr>
+            </a:gs>
+            <a:gs pos="50000">
+              <a:schemeClr val="phClr">
+                <a:tint val="98000"/>
+                <a:satMod val="130000"/>
+                <a:shade val="90000"/>
+                <a:lumMod val="103000"/>
+              </a:schemeClr>
+            </a:gs>
+            <a:gs pos="100000">
+              <a:schemeClr val="phClr">
+                <a:shade val="63000"/>
+                <a:satMod val="120000"/>
+              </a:schemeClr>
+            </a:gs>
+          </a:gsLst>
+          <a:lin ang="5400000" scaled="false"/>
+        </a:gradFill>
+      </a:bgFillStyleLst>
+    </a:fmtScheme>
+  </a:themeElements>
+  <a:objectDefaults/>
+  <a:extraClrSchemeLst/>
+</a:theme>
 </file>
</xml_diff>

<commit_message>
Manuscript revision 6 and round-6 letter: release 2.8.3
- Section 6 and the availability statement: releases 2.8.1 to 2.8.3
  repair seven defects, four in replay timing (adds the reversal
  applied to the wrong test); 436 tests. Two sentences in Section 7.8
  shortened to stay under 8,000 words (7,995; whitespace 7,929).
- Letter: the reviewed release is 2.8.3 (b84e7f8, e6ba351, 8d2de48 and
  this commit, which carries the v2.8.3 tag); v2.8.2 marks e6ba351.
  M5 states the 2.8.2 reversal rule and the 2.8.3 fix; test and
  reproduction counts updated (436 passed; 102 of 102 identical).

No code change.

Co-Authored-By: Claude Opus 5.5 <noreply@anthropic.com>
Claude-Session: https://claude.ai/code/session_01RjWdFzUgYk6Hwie2YbnvyG
</commit_message>
<xml_diff>
--- a/paper/rebuttal_round6.docx
+++ b/paper/rebuttal_round6.docx
@@ -63,7 +63,7 @@
         <w:t xml:space="preserve">Revised:</w:t>
       </w:r>
       <w:r>
-        <w:t xml:space="preserve"> release 2.8.2, which consists of commit b84e7f8 (the repository repairs for M4 and M5 and the revised part D of the analyses) and the commit that accompanies this letter (scripts/check_condition.py with its output results/condition_check.md, manuscript revision 6 and this letter); the v2.8.2 tag is on the latter. No simulated result changes: 102 recorded runs replayed with 2.8.2 are identical, and 434 tests pass, eighteen of them across two instances on a real Redis. Table, figure and equation numbers refer to revision 6 unless marked 'old'; Section 6 of this letter maps old figure numbers to new ones.</w:t>
+        <w:t xml:space="preserve"> release 2.8.3 (tag v2.8.3). It consists of commit b84e7f8 (the repository repairs for M4 and M5 and the revised part D of the analyses), commit e6ba351 (scripts/check_condition.py with its output results/condition_check.md, and the store-expiry measurement), commit 8d2de48 (the fix for a reversal edge our own audit of 2.8.2 found, described under M5, and SHA-256 checksums of the results files) and the commit that accompanies this letter (manuscript revision 6 and this letter; no code change), which carries the tag. Tag v2.8.2 (e6ba351) marks the state before the reversal fix. No simulated result changes: 102 recorded runs replayed with 2.8.3 are identical, and 436 tests pass, eighteen of them across two instances on a real Redis. Table, figure and equation numbers refer to revision 6 unless marked 'old'; Section 6 of this letter maps old figure numbers to new ones.</w:t>
       </w:r>
     </w:p>
     <w:p>
@@ -124,7 +124,7 @@
         <w:t xml:space="preserve">Manuscript.</w:t>
       </w:r>
       <w:r>
-        <w:t xml:space="preserve"> The scope is unchanged. The paper is 7,999 words from the title to the end of the reference list, counting tables, captions, declarations and references (alphanumeric tokens in the compiled PDF, figures as placeholders); a whitespace count gives 7,932. It compiles without overfull boxes in 24 pages.</w:t>
+        <w:t xml:space="preserve"> The scope is unchanged. The paper is 7,995 words from the title to the end of the reference list, counting tables, captions, declarations and references (alphanumeric tokens in the compiled PDF, figures as placeholders); a whitespace count gives 7,929. It compiles without overfull boxes in 24 pages.</w:t>
       </w:r>
     </w:p>
     <w:p>
@@ -232,7 +232,7 @@
         <w:t xml:space="preserve">Author actions before submission.</w:t>
       </w:r>
       <w:r>
-        <w:t xml:space="preserve"> The affiliation; written permission to describe the incident, or removal of the incident narrative; confirmation of Table 1's Source column; the highlights file; pushing the tags v2.8.0 (1c277a0), v2.8.1 (c34375f) and v2.8.2, and publishing a release with checksums of the results files (optionally a Zenodo DOI).</w:t>
+        <w:t xml:space="preserve"> The affiliation; written permission to describe the incident, or removal of the incident narrative; confirmation of Table 1's Source column; the highlights file; pushing the tags v2.8.0 (1c277a0), v2.8.1 (c34375f), v2.8.2 (e6ba351) and v2.8.3 (the commit accompanying this letter), and publishing the v2.8.3 release with results/CHECKSUMS.sha256 (optionally a Zenodo DOI).</w:t>
       </w:r>
     </w:p>
     <w:p>
@@ -400,7 +400,7 @@
         <w:spacing w:after="120"/>
       </w:pPr>
       <w:r>
-        <w:t xml:space="preserve">scripts/check_condition.py (the commit accompanying this letter) evaluates Equations 2, 3 and 4 for every recorded E4 security run from these inputs. It uses N, not the no-policy arm's measured leakage, as the cap, and min(N, …) in both equations, and writes results/condition_check.md. Results: the tests' estimate is 105, 139 and 240 against measured 110, 144 and 242 at 3, 10 and 30 blocks over an hour, and the counter's bound 72, 240 and 720 against 71, 240 and 679. In the 18 cells where the two estimates differ (3 to 300 blocks, 20 and 60 minutes, full-rate and quota-paced pumpers), the predicted ordering matches the measured one in all 18. In the other two, at 300 blocks over 20 minutes, both estimates equal N and no ordering is predicted (measured 673 against 676 and 697 against 686). For paced pumpers on 3 to 30 blocks the tests' estimate is about 20 % low (18 against 23 on three blocks), and the ordering still holds.</w:t>
+        <w:t xml:space="preserve">scripts/check_condition.py (e6ba351) evaluates Equations 2, 3 and 4 for every recorded E4 security run from these inputs. It uses N, not the no-policy arm's measured leakage, as the cap, and min(N, …) in both equations, and writes results/condition_check.md. Results: the tests' estimate is 105, 139 and 240 against measured 110, 144 and 242 at 3, 10 and 30 blocks over an hour, and the counter's bound 72, 240 and 720 against 71, 240 and 679. In the 18 cells where the two estimates differ (3 to 300 blocks, 20 and 60 minutes, full-rate and quota-paced pumpers), the predicted ordering matches the measured one in all 18. In the other two, at 300 blocks over 20 minutes, both estimates equal N and no ordering is predicted (measured 673 against 676 and 697 against 686). For paced pumpers on 3 to 30 blocks the tests' estimate is about 20 % low (18 against 23 on three blocks), and the ordering still holds.</w:t>
       </w:r>
     </w:p>
     <w:p>
@@ -431,7 +431,7 @@
         <w:t xml:space="preserve">Where:</w:t>
       </w:r>
       <w:r>
-        <w:t xml:space="preserve"> scripts/check_condition.py and results/condition_check.md (the commit accompanying this letter); results/round5_analyses.md, part D (b84e7f8); paper/figures.py (unfitted_estimates). Manuscript Section 5, Section 7.6, Figure 4.</w:t>
+        <w:t xml:space="preserve"> scripts/check_condition.py and results/condition_check.md (e6ba351); results/round5_analyses.md, part D (b84e7f8); paper/figures.py (unfitted_estimates). Manuscript Section 5, Section 7.6, Figure 4.</w:t>
       </w:r>
     </w:p>
     <w:p>
@@ -613,7 +613,7 @@
           <w:bCs/>
           <w:color w:val="1E6B3A"/>
         </w:rPr>
-        <w:t xml:space="preserve">Fixed in 2.8.2 (b84e7f8): event-time semantics defined and tested</w:t>
+        <w:t xml:space="preserve">Fixed in 2.8.2 (b84e7f8) and 2.8.3 (8d2de48): event-time semantics defined and tested</w:t>
       </w:r>
     </w:p>
     <w:p>
@@ -635,7 +635,7 @@
         <w:spacing w:after="120"/>
       </w:pPr>
       <w:r>
-        <w:t xml:space="preserve">Reproduced on 2.8.1: the verdict was dated 600 seconds after its transition. In 2.8.2 _block_event receives the event's recorded time, and the semantics are defined at the top of feedback.py. An event counts toward the test that was running at its time; one dated before the block's last crossing belongs to a concluded test and is recorded, not counted, so it cannot cause a crossing. A crossing issues its verdict at the event's time, with the verdict's lifetime running from then, and escalates against the verdict active at that time. A reversal subtracts its failure only if that failure is dated at or after the block's last crossing. Block documents written by 2.8.1 are still read. On the live path the event's time is the clock's, so nothing changes there; what a replay can still differ in is when the operator learns of the verdict.</w:t>
+        <w:t xml:space="preserve">Reproduced on 2.8.1: the verdict was dated 600 seconds after its transition. In 2.8.2 _block_event receives the event's recorded time, and the semantics are defined at the top of feedback.py. An event counts toward the test that was running at its time; one dated before the block's last crossing belongs to a concluded test and is recorded, not counted, so it cannot cause a crossing. A crossing issues its verdict at the event's time, with the verdict's lifetime running from then, and escalates against the verdict active at that time. In 2.8.2 a reversal subtracted its failure only if that failure was dated at or after the block's last crossing; 2.8.3 subtracts it only if the test now running counted it (next paragraph). Block documents written by 2.8.1 and 2.8.2 are still read. On the live path the event's time is the clock's, so nothing changes there; what a replay can still differ in is when the operator learns of the verdict.</w:t>
       </w:r>
     </w:p>
     <w:p>
@@ -651,7 +651,7 @@
         <w:spacing w:after="120"/>
       </w:pPr>
       <w:r>
-        <w:t xml:space="preserve">Our own audit of 2.8.2 found one edge the reordering rules did not cover. A failure counted in a test that a replayed, earlier-dated event then concludes is dated after the crossing it preceded in processing. A late reversal of that failure therefore subtracted it from the new test (in our example the new statistic was −3.58 instead of −2.08). Release 2.8.3 (tag v2.8.3) fixes it: every counted event is recorded with the number of the test that counted it, and a reversal subtracts its failure only within that test. The regression test test_reversal_of_a_failure_the_concluded_test_counted_leaves_the_next_test fails on 2.8.2 and passes on 2.8.3; the live path is unchanged and the 102-run reproduction check is identical.</w:t>
+        <w:t xml:space="preserve">Our own audit of 2.8.2 found one edge the reordering rules did not cover. A failure counted in a test that a replayed, earlier-dated event then concludes is dated after the crossing it preceded in processing. A late reversal of that failure therefore subtracted it from the new test (in our example the new statistic was −3.58 instead of −2.08). Release 2.8.3 (8d2de48) fixes it: every counted event is recorded with the number of the test that counted it, and a reversal subtracts its failure only within that test. The regression test test_reversal_of_a_failure_the_concluded_test_counted_leaves_the_next_test fails on 2.8.2 and passes on 2.8.3; the live path is unchanged and the 102-run reproduction check is identical.</w:t>
       </w:r>
     </w:p>
     <w:p>
@@ -674,7 +674,7 @@
         <w:t xml:space="preserve">Where:</w:t>
       </w:r>
       <w:r>
-        <w:t xml:space="preserve"> feedback.py (_apply, _block_event, module notes); tests/unit/test_sixth_round.py; tests/integration/test_real_redis.py (b84e7f8). Manuscript Section 4.2.</w:t>
+        <w:t xml:space="preserve"> feedback.py (_apply, _block_event, module notes); tests/unit/test_sixth_round.py; tests/integration/test_real_redis.py (b84e7f8); the reversal fix and its test (8d2de48). Manuscript Sections 4.2 and 6.</w:t>
       </w:r>
     </w:p>
     <w:p>
@@ -1065,7 +1065,7 @@
       </w:tr>
       <w:tr>
         <w:trPr>
-          <w:tblHeader w:val="off"/>
+          <w:tblHeader w:val="false"/>
         </w:trPr>
         <w:tc>
           <w:tcPr>
@@ -1157,7 +1157,7 @@
       </w:tr>
       <w:tr>
         <w:trPr>
-          <w:tblHeader w:val="off"/>
+          <w:tblHeader w:val="false"/>
         </w:trPr>
         <w:tc>
           <w:tcPr>
@@ -1249,7 +1249,7 @@
       </w:tr>
       <w:tr>
         <w:trPr>
-          <w:tblHeader w:val="off"/>
+          <w:tblHeader w:val="false"/>
         </w:trPr>
         <w:tc>
           <w:tcPr>
@@ -1341,7 +1341,7 @@
       </w:tr>
       <w:tr>
         <w:trPr>
-          <w:tblHeader w:val="off"/>
+          <w:tblHeader w:val="false"/>
         </w:trPr>
         <w:tc>
           <w:tcPr>
@@ -1433,7 +1433,7 @@
       </w:tr>
       <w:tr>
         <w:trPr>
-          <w:tblHeader w:val="off"/>
+          <w:tblHeader w:val="false"/>
         </w:trPr>
         <w:tc>
           <w:tcPr>
@@ -1525,7 +1525,7 @@
       </w:tr>
       <w:tr>
         <w:trPr>
-          <w:tblHeader w:val="off"/>
+          <w:tblHeader w:val="false"/>
         </w:trPr>
         <w:tc>
           <w:tcPr>
@@ -1617,7 +1617,7 @@
       </w:tr>
       <w:tr>
         <w:trPr>
-          <w:tblHeader w:val="off"/>
+          <w:tblHeader w:val="false"/>
         </w:trPr>
         <w:tc>
           <w:tcPr>
@@ -1709,7 +1709,7 @@
       </w:tr>
       <w:tr>
         <w:trPr>
-          <w:tblHeader w:val="off"/>
+          <w:tblHeader w:val="false"/>
         </w:trPr>
         <w:tc>
           <w:tcPr>
@@ -1801,7 +1801,7 @@
       </w:tr>
       <w:tr>
         <w:trPr>
-          <w:tblHeader w:val="off"/>
+          <w:tblHeader w:val="false"/>
         </w:trPr>
         <w:tc>
           <w:tcPr>
@@ -1893,7 +1893,7 @@
       </w:tr>
       <w:tr>
         <w:trPr>
-          <w:tblHeader w:val="off"/>
+          <w:tblHeader w:val="false"/>
         </w:trPr>
         <w:tc>
           <w:tcPr>
@@ -2278,7 +2278,7 @@
         <w:t xml:space="preserve">Release information.</w:t>
       </w:r>
       <w:r>
-        <w:t xml:space="preserve"> The citation identifies 2.8.0 as the result-generating release and 2.8.1 and 2.8.2 as the repairs. Publishing the tags and a release with checksums is an author action before submission.</w:t>
+        <w:t xml:space="preserve"> The paper identifies 2.8.0 as the result-generating release and 2.8.1 to 2.8.3 as the repairs. Publishing the tags and a release with checksums is an author action before submission.</w:t>
       </w:r>
     </w:p>
     <w:tbl>
@@ -2368,7 +2368,7 @@
       </w:tr>
       <w:tr>
         <w:trPr>
-          <w:tblHeader w:val="off"/>
+          <w:tblHeader w:val="false"/>
         </w:trPr>
         <w:tc>
           <w:tcPr>
@@ -2431,7 +2431,7 @@
       </w:tr>
       <w:tr>
         <w:trPr>
-          <w:tblHeader w:val="off"/>
+          <w:tblHeader w:val="false"/>
         </w:trPr>
         <w:tc>
           <w:tcPr>
@@ -2494,7 +2494,7 @@
       </w:tr>
       <w:tr>
         <w:trPr>
-          <w:tblHeader w:val="off"/>
+          <w:tblHeader w:val="false"/>
         </w:trPr>
         <w:tc>
           <w:tcPr>
@@ -2557,7 +2557,7 @@
       </w:tr>
       <w:tr>
         <w:trPr>
-          <w:tblHeader w:val="off"/>
+          <w:tblHeader w:val="false"/>
         </w:trPr>
         <w:tc>
           <w:tcPr>
@@ -2620,7 +2620,7 @@
       </w:tr>
       <w:tr>
         <w:trPr>
-          <w:tblHeader w:val="off"/>
+          <w:tblHeader w:val="false"/>
         </w:trPr>
         <w:tc>
           <w:tcPr>
@@ -2683,7 +2683,7 @@
       </w:tr>
       <w:tr>
         <w:trPr>
-          <w:tblHeader w:val="off"/>
+          <w:tblHeader w:val="false"/>
         </w:trPr>
         <w:tc>
           <w:tcPr>
@@ -2746,7 +2746,7 @@
       </w:tr>
       <w:tr>
         <w:trPr>
-          <w:tblHeader w:val="off"/>
+          <w:tblHeader w:val="false"/>
         </w:trPr>
         <w:tc>
           <w:tcPr>
@@ -3005,7 +3005,7 @@
       </w:tr>
       <w:tr>
         <w:trPr>
-          <w:tblHeader w:val="off"/>
+          <w:tblHeader w:val="false"/>
         </w:trPr>
         <w:tc>
           <w:tcPr>
@@ -3068,7 +3068,7 @@
       </w:tr>
       <w:tr>
         <w:trPr>
-          <w:tblHeader w:val="off"/>
+          <w:tblHeader w:val="false"/>
         </w:trPr>
         <w:tc>
           <w:tcPr>
@@ -3124,14 +3124,14 @@
                 <w:sz w:val="18"/>
                 <w:szCs w:val="18"/>
               </w:rPr>
-              <w:t xml:space="preserve">Reproduced on 2.8.1 (verdict dated 600 s after its transition). Fixed in 2.8.2: the verdict is dated at the transition, escalation and reordering have defined rules, and each is tested (M5).</w:t>
+              <w:t xml:space="preserve">Reproduced on 2.8.1 (verdict dated 600 s after its transition). Fixed in 2.8.2: the verdict is dated at the transition, escalation and reordering have defined rules, and each is tested; the reversal edge our audit found is fixed in 2.8.3 (M5).</w:t>
             </w:r>
           </w:p>
         </w:tc>
       </w:tr>
       <w:tr>
         <w:trPr>
-          <w:tblHeader w:val="off"/>
+          <w:tblHeader w:val="false"/>
         </w:trPr>
         <w:tc>
           <w:tcPr>
@@ -3194,7 +3194,7 @@
       </w:tr>
       <w:tr>
         <w:trPr>
-          <w:tblHeader w:val="off"/>
+          <w:tblHeader w:val="false"/>
         </w:trPr>
         <w:tc>
           <w:tcPr>
@@ -3257,7 +3257,7 @@
       </w:tr>
       <w:tr>
         <w:trPr>
-          <w:tblHeader w:val="off"/>
+          <w:tblHeader w:val="false"/>
         </w:trPr>
         <w:tc>
           <w:tcPr>
@@ -3313,7 +3313,7 @@
                 <w:sz w:val="18"/>
                 <w:szCs w:val="18"/>
               </w:rPr>
-              <w:t xml:space="preserve">scripts/check_reproduction.py with 2.8.2: 102 of 102 sampled runs identical. The full suite: 434 tests pass, eighteen across two instances on a real Redis (results/test_report.txt). Checking this found the store-expiry difference reported above, which we disclose and have not changed.</w:t>
+              <w:t xml:space="preserve">scripts/check_reproduction.py with 2.8.3: 102 of 102 sampled runs identical. The full suite: 436 tests pass, eighteen across two instances on a real Redis (results/test_report.txt). Checking this found the store-expiry difference reported above, which we disclose and have not changed.</w:t>
             </w:r>
           </w:p>
         </w:tc>
@@ -3452,7 +3452,7 @@
       </w:tr>
       <w:tr>
         <w:trPr>
-          <w:tblHeader w:val="off"/>
+          <w:tblHeader w:val="false"/>
         </w:trPr>
         <w:tc>
           <w:tcPr>
@@ -3544,7 +3544,7 @@
       </w:tr>
       <w:tr>
         <w:trPr>
-          <w:tblHeader w:val="off"/>
+          <w:tblHeader w:val="false"/>
         </w:trPr>
         <w:tc>
           <w:tcPr>
@@ -3629,14 +3629,14 @@
                 <w:sz w:val="18"/>
                 <w:szCs w:val="18"/>
               </w:rPr>
-              <w:t xml:space="preserve">Same-block reordering fixed (M4) and block-test events, verdicts and escalation dated at the transition's time (M5), both in 2.8.2 with tests that fail on 2.8.1.</w:t>
+              <w:t xml:space="preserve">Same-block reordering fixed (M4) and block-test events, verdicts and escalation dated at the transition's time (M5), both in 2.8.2 with tests that fail on 2.8.1; the reversal edge in 2.8.3, with a test that fails on 2.8.2.</w:t>
             </w:r>
           </w:p>
         </w:tc>
       </w:tr>
       <w:tr>
         <w:trPr>
-          <w:tblHeader w:val="off"/>
+          <w:tblHeader w:val="false"/>
         </w:trPr>
         <w:tc>
           <w:tcPr>
@@ -3728,7 +3728,7 @@
       </w:tr>
       <w:tr>
         <w:trPr>
-          <w:tblHeader w:val="off"/>
+          <w:tblHeader w:val="false"/>
         </w:trPr>
         <w:tc>
           <w:tcPr>
@@ -3820,7 +3820,7 @@
       </w:tr>
       <w:tr>
         <w:trPr>
-          <w:tblHeader w:val="off"/>
+          <w:tblHeader w:val="false"/>
         </w:trPr>
         <w:tc>
           <w:tcPr>
@@ -3912,7 +3912,7 @@
       </w:tr>
       <w:tr>
         <w:trPr>
-          <w:tblHeader w:val="off"/>
+          <w:tblHeader w:val="false"/>
         </w:trPr>
         <w:tc>
           <w:tcPr>
@@ -4004,7 +4004,7 @@
       </w:tr>
       <w:tr>
         <w:trPr>
-          <w:tblHeader w:val="off"/>
+          <w:tblHeader w:val="false"/>
         </w:trPr>
         <w:tc>
           <w:tcPr>
@@ -4096,7 +4096,7 @@
       </w:tr>
       <w:tr>
         <w:trPr>
-          <w:tblHeader w:val="off"/>
+          <w:tblHeader w:val="false"/>
         </w:trPr>
         <w:tc>
           <w:tcPr>
@@ -4201,7 +4201,7 @@
       </w:r>
     </w:p>
     <w:sectPr>
-      <w:footerReference w:type="default" r:id="rId6"/>
+      <w:footerReference w:type="default" r:id="rId7"/>
       <w:pgSz w:w="11906" w:h="16838" w:orient="portrait"/>
       <w:pgMar w:top="1250" w:right="1300" w:bottom="1250" w:left="1300" w:header="708" w:footer="708" w:gutter="0"/>
       <w:pgNumType/>
@@ -4209,6 +4209,10 @@
     </w:sectPr>
   </w:body>
 </w:document>
+</file>
+
+<file path=word/comments.xml><?xml version="1.0" encoding="utf-8"?>
+<w:comments xmlns:cx="http://schemas.microsoft.com/office/drawing/2014/chartex" xmlns:cx1="http://schemas.microsoft.com/office/drawing/2015/9/8/chartex" xmlns:cx2="http://schemas.microsoft.com/office/drawing/2015/10/21/chartex" xmlns:cx3="http://schemas.microsoft.com/office/drawing/2016/5/9/chartex" xmlns:cx4="http://schemas.microsoft.com/office/drawing/2016/5/10/chartex" xmlns:cx5="http://schemas.microsoft.com/office/drawing/2016/5/11/chartex" xmlns:cx6="http://schemas.microsoft.com/office/drawing/2016/5/12/chartex" xmlns:cx7="http://schemas.microsoft.com/office/drawing/2016/5/13/chartex" xmlns:cx8="http://schemas.microsoft.com/office/drawing/2016/5/14/chartex" xmlns:mc="http://schemas.openxmlformats.org/markup-compatibility/2006" xmlns:aink="http://schemas.microsoft.com/office/drawing/2016/ink" xmlns:am3d="http://schemas.microsoft.com/office/drawing/2017/model3d" xmlns:o="urn:schemas-microsoft-com:office:office" xmlns:r="http://schemas.openxmlformats.org/officeDocument/2006/relationships" xmlns:m="http://schemas.openxmlformats.org/officeDocument/2006/math" xmlns:v="urn:schemas-microsoft-com:vml" xmlns:wp14="http://schemas.microsoft.com/office/word/2010/wordprocessingDrawing" xmlns:wp="http://schemas.openxmlformats.org/drawingml/2006/wordprocessingDrawing" xmlns:w10="urn:schemas-microsoft-com:office:word" xmlns:w="http://schemas.openxmlformats.org/wordprocessingml/2006/main" xmlns:w14="http://schemas.microsoft.com/office/word/2010/wordml" xmlns:w15="http://schemas.microsoft.com/office/word/2012/wordml" xmlns:w16cex="http://schemas.microsoft.com/office/word/2018/wordml/cex" xmlns:w16cid="http://schemas.microsoft.com/office/word/2016/wordml/cid" xmlns:w16="http://schemas.microsoft.com/office/word/2018/wordml" xmlns:w16sdtdh="http://schemas.microsoft.com/office/word/2020/wordml/sdtdatahash" xmlns:w16se="http://schemas.microsoft.com/office/word/2015/wordml/symex" xmlns:wpg="http://schemas.microsoft.com/office/word/2010/wordprocessingGroup" xmlns:wpi="http://schemas.microsoft.com/office/word/2010/wordprocessingInk" xmlns:wne="http://schemas.microsoft.com/office/word/2006/wordml" xmlns:wps="http://schemas.microsoft.com/office/word/2010/wordprocessingShape"/>
 </file>
 
 <file path=word/endnotes.xml><?xml version="1.0" encoding="utf-8"?>
@@ -4310,7 +4314,7 @@
 <w:numbering xmlns:wpc="http://schemas.microsoft.com/office/word/2010/wordprocessingCanvas" xmlns:mc="http://schemas.openxmlformats.org/markup-compatibility/2006" xmlns:o="urn:schemas-microsoft-com:office:office" xmlns:r="http://schemas.openxmlformats.org/officeDocument/2006/relationships" xmlns:m="http://schemas.openxmlformats.org/officeDocument/2006/math" xmlns:v="urn:schemas-microsoft-com:vml" xmlns:wp14="http://schemas.microsoft.com/office/word/2010/wordprocessingDrawing" xmlns:wp="http://schemas.openxmlformats.org/drawingml/2006/wordprocessingDrawing" xmlns:w10="urn:schemas-microsoft-com:office:word" xmlns:w="http://schemas.openxmlformats.org/wordprocessingml/2006/main" xmlns:w14="http://schemas.microsoft.com/office/word/2010/wordml" xmlns:w15="http://schemas.microsoft.com/office/word/2012/wordml" xmlns:wpg="http://schemas.microsoft.com/office/word/2010/wordprocessingGroup" xmlns:wpi="http://schemas.microsoft.com/office/word/2010/wordprocessingInk" xmlns:wne="http://schemas.microsoft.com/office/word/2006/wordml" xmlns:wps="http://schemas.microsoft.com/office/word/2010/wordprocessingShape" mc:Ignorable="w14 w15 wp14">
   <w:abstractNum w:abstractNumId="1" w15:restartNumberingAfterBreak="0">
     <w:multiLevelType w:val="hybridMultilevel"/>
-    <w:lvl w:ilvl="0" w:tentative="1">
+    <w:lvl w:ilvl="0" w15:tentative="1">
       <w:start w:val="1"/>
       <w:numFmt w:val="bullet"/>
       <w:lvlText w:val="●"/>
@@ -4319,7 +4323,7 @@
         <w:ind w:left="720" w:hanging="360"/>
       </w:pPr>
     </w:lvl>
-    <w:lvl w:ilvl="1" w:tentative="1">
+    <w:lvl w:ilvl="1" w15:tentative="1">
       <w:start w:val="1"/>
       <w:numFmt w:val="bullet"/>
       <w:lvlText w:val="○"/>
@@ -4328,7 +4332,7 @@
         <w:ind w:left="1440" w:hanging="360"/>
       </w:pPr>
     </w:lvl>
-    <w:lvl w:ilvl="2" w:tentative="1">
+    <w:lvl w:ilvl="2" w15:tentative="1">
       <w:start w:val="1"/>
       <w:numFmt w:val="bullet"/>
       <w:lvlText w:val="■"/>
@@ -4337,7 +4341,7 @@
         <w:ind w:left="2160" w:hanging="360"/>
       </w:pPr>
     </w:lvl>
-    <w:lvl w:ilvl="3" w:tentative="1">
+    <w:lvl w:ilvl="3" w15:tentative="1">
       <w:start w:val="1"/>
       <w:numFmt w:val="bullet"/>
       <w:lvlText w:val="●"/>
@@ -4346,7 +4350,7 @@
         <w:ind w:left="2880" w:hanging="360"/>
       </w:pPr>
     </w:lvl>
-    <w:lvl w:ilvl="4" w:tentative="1">
+    <w:lvl w:ilvl="4" w15:tentative="1">
       <w:start w:val="1"/>
       <w:numFmt w:val="bullet"/>
       <w:lvlText w:val="○"/>
@@ -4355,7 +4359,7 @@
         <w:ind w:left="3600" w:hanging="360"/>
       </w:pPr>
     </w:lvl>
-    <w:lvl w:ilvl="5" w:tentative="1">
+    <w:lvl w:ilvl="5" w15:tentative="1">
       <w:start w:val="1"/>
       <w:numFmt w:val="bullet"/>
       <w:lvlText w:val="■"/>
@@ -4364,7 +4368,7 @@
         <w:ind w:left="4320" w:hanging="360"/>
       </w:pPr>
     </w:lvl>
-    <w:lvl w:ilvl="6" w:tentative="1">
+    <w:lvl w:ilvl="6" w15:tentative="1">
       <w:start w:val="1"/>
       <w:numFmt w:val="bullet"/>
       <w:lvlText w:val="●"/>
@@ -4373,7 +4377,7 @@
         <w:ind w:left="5040" w:hanging="360"/>
       </w:pPr>
     </w:lvl>
-    <w:lvl w:ilvl="7" w:tentative="1">
+    <w:lvl w:ilvl="7" w15:tentative="1">
       <w:start w:val="1"/>
       <w:numFmt w:val="bullet"/>
       <w:lvlText w:val="●"/>
@@ -4382,7 +4386,7 @@
         <w:ind w:left="5760" w:hanging="360"/>
       </w:pPr>
     </w:lvl>
-    <w:lvl w:ilvl="8" w:tentative="1">
+    <w:lvl w:ilvl="8" w15:tentative="1">
       <w:start w:val="1"/>
       <w:numFmt w:val="bullet"/>
       <w:lvlText w:val="●"/>
@@ -4394,7 +4398,7 @@
   </w:abstractNum>
   <w:abstractNum w:abstractNumId="2" w15:restartNumberingAfterBreak="0">
     <w:multiLevelType w:val="hybridMultilevel"/>
-    <w:lvl w:ilvl="0" w:tentative="1">
+    <w:lvl w:ilvl="0" w15:tentative="1">
       <w:start w:val="1"/>
       <w:numFmt w:val="bullet"/>
       <w:lvlText w:val="•"/>
@@ -4431,10 +4435,6 @@
     </w:rPrDefault>
     <w:pPrDefault/>
   </w:docDefaults>
-  <w:style w:type="paragraph" w:styleId="Normal" w:default="1">
-    <w:name w:val="Normal"/>
-    <w:qFormat/>
-  </w:style>
   <w:style w:type="paragraph" w:styleId="Title">
     <w:name w:val="Title"/>
     <w:basedOn w:val="Normal"/>
@@ -4443,6 +4443,28 @@
     <w:rPr>
       <w:sz w:val="56"/>
       <w:szCs w:val="56"/>
+    </w:rPr>
+  </w:style>
+  <w:style w:type="paragraph" w:styleId="Heading1">
+    <w:name w:val="Heading 1"/>
+    <w:basedOn w:val="Normal"/>
+    <w:next w:val="Normal"/>
+    <w:qFormat/>
+    <w:rPr>
+      <w:color w:val="2E74B5"/>
+      <w:sz w:val="32"/>
+      <w:szCs w:val="32"/>
+    </w:rPr>
+  </w:style>
+  <w:style w:type="paragraph" w:styleId="Heading2">
+    <w:name w:val="Heading 2"/>
+    <w:basedOn w:val="Normal"/>
+    <w:next w:val="Normal"/>
+    <w:qFormat/>
+    <w:rPr>
+      <w:color w:val="2E74B5"/>
+      <w:sz w:val="26"/>
+      <w:szCs w:val="26"/>
     </w:rPr>
   </w:style>
   <w:style w:type="paragraph" w:styleId="Heading3">
@@ -4619,294 +4641,4 @@
     </w:rPr>
   </w:style>
 </w:styles>
-</file>
-
-<file path=word/theme/theme1.xml><?xml version="1.0" encoding="utf-8"?>
-<a:theme xmlns:a="http://schemas.openxmlformats.org/drawingml/2006/main" name="Office Theme">
-  <a:themeElements>
-    <a:clrScheme name="Office">
-      <a:dk1>
-        <a:sysClr val="windowText" lastClr="000000"/>
-      </a:dk1>
-      <a:lt1>
-        <a:sysClr val="window" lastClr="FFFFFF"/>
-      </a:lt1>
-      <a:dk2>
-        <a:srgbClr val="44546A"/>
-      </a:dk2>
-      <a:lt2>
-        <a:srgbClr val="E7E6E6"/>
-      </a:lt2>
-      <a:accent1>
-        <a:srgbClr val="4472C4"/>
-      </a:accent1>
-      <a:accent2>
-        <a:srgbClr val="ED7D31"/>
-      </a:accent2>
-      <a:accent3>
-        <a:srgbClr val="A5A5A5"/>
-      </a:accent3>
-      <a:accent4>
-        <a:srgbClr val="FFC000"/>
-      </a:accent4>
-      <a:accent5>
-        <a:srgbClr val="5B9BD5"/>
-      </a:accent5>
-      <a:accent6>
-        <a:srgbClr val="70AD47"/>
-      </a:accent6>
-      <a:hlink>
-        <a:srgbClr val="0563C1"/>
-      </a:hlink>
-      <a:folHlink>
-        <a:srgbClr val="954F72"/>
-      </a:folHlink>
-    </a:clrScheme>
-    <a:fontScheme name="Office">
-      <a:majorFont>
-        <a:latin typeface="Calibri Light" panose="020F0302020204030204"/>
-        <a:ea typeface=""/>
-        <a:cs typeface=""/>
-        <a:font script="Jpan" typeface="游ゴシック Light"/>
-        <a:font script="Hang" typeface="맑은 고딕"/>
-        <a:font script="Hans" typeface="等线 Light"/>
-        <a:font script="Hant" typeface="新細明體"/>
-        <a:font script="Arab" typeface="Times New Roman"/>
-        <a:font script="Hebr" typeface="Times New Roman"/>
-        <a:font script="Thai" typeface="Angsana New"/>
-        <a:font script="Ethi" typeface="Nyala"/>
-        <a:font script="Beng" typeface="Vrinda"/>
-        <a:font script="Gujr" typeface="Shruti"/>
-        <a:font script="Khmr" typeface="MoolBoran"/>
-        <a:font script="Knda" typeface="Tunga"/>
-        <a:font script="Guru" typeface="Raavi"/>
-        <a:font script="Cans" typeface="Euphemia"/>
-        <a:font script="Cher" typeface="Plantagenet Cherokee"/>
-        <a:font script="Yiii" typeface="Microsoft Yi Baiti"/>
-        <a:font script="Tibt" typeface="Microsoft Himalaya"/>
-        <a:font script="Thaa" typeface="MV Boli"/>
-        <a:font script="Deva" typeface="Mangal"/>
-        <a:font script="Telu" typeface="Gautami"/>
-        <a:font script="Taml" typeface="Latha"/>
-        <a:font script="Syrc" typeface="Estrangelo Edessa"/>
-        <a:font script="Orya" typeface="Kalinga"/>
-        <a:font script="Mlym" typeface="Kartika"/>
-        <a:font script="Laoo" typeface="DokChampa"/>
-        <a:font script="Sinh" typeface="Iskoola Pota"/>
-        <a:font script="Mong" typeface="Mongolian Baiti"/>
-        <a:font script="Viet" typeface="Times New Roman"/>
-        <a:font script="Uigh" typeface="Microsoft Uighur"/>
-        <a:font script="Geor" typeface="Sylfaen"/>
-        <a:font script="Armn" typeface="Arial"/>
-        <a:font script="Bugi" typeface="Leelawadee UI"/>
-        <a:font script="Bopo" typeface="Microsoft JhengHei"/>
-        <a:font script="Java" typeface="Javanese Text"/>
-        <a:font script="Lisu" typeface="Segoe UI"/>
-        <a:font script="Mymr" typeface="Myanmar Text"/>
-        <a:font script="Nkoo" typeface="Ebrima"/>
-        <a:font script="Olck" typeface="Nirmala UI"/>
-        <a:font script="Osma" typeface="Ebrima"/>
-        <a:font script="Phag" typeface="Phagspa"/>
-        <a:font script="Syrn" typeface="Estrangelo Edessa"/>
-        <a:font script="Syrj" typeface="Estrangelo Edessa"/>
-        <a:font script="Syre" typeface="Estrangelo Edessa"/>
-        <a:font script="Sora" typeface="Nirmala UI"/>
-        <a:font script="Tale" typeface="Microsoft Tai Le"/>
-        <a:font script="Talu" typeface="Microsoft New Tai Lue"/>
-        <a:font script="Tfng" typeface="Ebrima"/>
-      </a:majorFont>
-      <a:minorFont>
-        <a:latin typeface="Calibri" panose="020F0502020204030204"/>
-        <a:ea typeface=""/>
-        <a:cs typeface=""/>
-        <a:font script="Jpan" typeface="游明朝"/>
-        <a:font script="Hang" typeface="맑은 고딕"/>
-        <a:font script="Hans" typeface="等线"/>
-        <a:font script="Hant" typeface="新細明體"/>
-        <a:font script="Arab" typeface="Arial"/>
-        <a:font script="Hebr" typeface="Arial"/>
-        <a:font script="Thai" typeface="Cordia New"/>
-        <a:font script="Ethi" typeface="Nyala"/>
-        <a:font script="Beng" typeface="Vrinda"/>
-        <a:font script="Gujr" typeface="Shruti"/>
-        <a:font script="Khmr" typeface="DaunPenh"/>
-        <a:font script="Knda" typeface="Tunga"/>
-        <a:font script="Guru" typeface="Raavi"/>
-        <a:font script="Cans" typeface="Euphemia"/>
-        <a:font script="Cher" typeface="Plantagenet Cherokee"/>
-        <a:font script="Yiii" typeface="Microsoft Yi Baiti"/>
-        <a:font script="Tibt" typeface="Microsoft Himalaya"/>
-        <a:font script="Thaa" typeface="MV Boli"/>
-        <a:font script="Deva" typeface="Mangal"/>
-        <a:font script="Telu" typeface="Gautami"/>
-        <a:font script="Taml" typeface="Latha"/>
-        <a:font script="Syrc" typeface="Estrangelo Edessa"/>
-        <a:font script="Orya" typeface="Kalinga"/>
-        <a:font script="Mlym" typeface="Kartika"/>
-        <a:font script="Laoo" typeface="DokChampa"/>
-        <a:font script="Sinh" typeface="Iskoola Pota"/>
-        <a:font script="Mong" typeface="Mongolian Baiti"/>
-        <a:font script="Viet" typeface="Arial"/>
-        <a:font script="Uigh" typeface="Microsoft Uighur"/>
-        <a:font script="Geor" typeface="Sylfaen"/>
-        <a:font script="Armn" typeface="Arial"/>
-        <a:font script="Bugi" typeface="Leelawadee UI"/>
-        <a:font script="Bopo" typeface="Microsoft JhengHei"/>
-        <a:font script="Java" typeface="Javanese Text"/>
-        <a:font script="Lisu" typeface="Segoe UI"/>
-        <a:font script="Mymr" typeface="Myanmar Text"/>
-        <a:font script="Nkoo" typeface="Ebrima"/>
-        <a:font script="Olck" typeface="Nirmala UI"/>
-        <a:font script="Osma" typeface="Ebrima"/>
-        <a:font script="Phag" typeface="Phagspa"/>
-        <a:font script="Syrn" typeface="Estrangelo Edessa"/>
-        <a:font script="Syrj" typeface="Estrangelo Edessa"/>
-        <a:font script="Syre" typeface="Estrangelo Edessa"/>
-        <a:font script="Sora" typeface="Nirmala UI"/>
-        <a:font script="Tale" typeface="Microsoft Tai Le"/>
-        <a:font script="Talu" typeface="Microsoft New Tai Lue"/>
-        <a:font script="Tfng" typeface="Ebrima"/>
-      </a:minorFont>
-    </a:fontScheme>
-    <a:fmtScheme name="Office">
-      <a:fillStyleLst>
-        <a:solidFill>
-          <a:schemeClr val="phClr"/>
-        </a:solidFill>
-        <a:gradFill rotWithShape="true">
-          <a:gsLst>
-            <a:gs pos="0">
-              <a:schemeClr val="phClr">
-                <a:lumMod val="110000"/>
-                <a:satMod val="105000"/>
-                <a:tint val="67000"/>
-              </a:schemeClr>
-            </a:gs>
-            <a:gs pos="50000">
-              <a:schemeClr val="phClr">
-                <a:lumMod val="105000"/>
-                <a:satMod val="103000"/>
-                <a:tint val="73000"/>
-              </a:schemeClr>
-            </a:gs>
-            <a:gs pos="100000">
-              <a:schemeClr val="phClr">
-                <a:lumMod val="105000"/>
-                <a:satMod val="109000"/>
-                <a:tint val="81000"/>
-              </a:schemeClr>
-            </a:gs>
-          </a:gsLst>
-          <a:lin ang="5400000" scaled="false"/>
-        </a:gradFill>
-        <a:gradFill rotWithShape="true">
-          <a:gsLst>
-            <a:gs pos="0">
-              <a:schemeClr val="phClr">
-                <a:satMod val="103000"/>
-                <a:lumMod val="102000"/>
-                <a:tint val="94000"/>
-              </a:schemeClr>
-            </a:gs>
-            <a:gs pos="50000">
-              <a:schemeClr val="phClr">
-                <a:satMod val="110000"/>
-                <a:lumMod val="100000"/>
-                <a:shade val="100000"/>
-              </a:schemeClr>
-            </a:gs>
-            <a:gs pos="100000">
-              <a:schemeClr val="phClr">
-                <a:lumMod val="99000"/>
-                <a:satMod val="120000"/>
-                <a:shade val="78000"/>
-              </a:schemeClr>
-            </a:gs>
-          </a:gsLst>
-          <a:lin ang="5400000" scaled="false"/>
-        </a:gradFill>
-      </a:fillStyleLst>
-      <a:lnStyleLst>
-        <a:ln w="6350" cap="flat" cmpd="sng" algn="ctr">
-          <a:solidFill>
-            <a:schemeClr val="phClr"/>
-          </a:solidFill>
-          <a:prstDash val="solid"/>
-          <a:miter lim="800000"/>
-        </a:ln>
-        <a:ln w="12700" cap="flat" cmpd="sng" algn="ctr">
-          <a:solidFill>
-            <a:schemeClr val="phClr"/>
-          </a:solidFill>
-          <a:prstDash val="solid"/>
-          <a:miter lim="800000"/>
-        </a:ln>
-        <a:ln w="19050" cap="flat" cmpd="sng" algn="ctr">
-          <a:solidFill>
-            <a:schemeClr val="phClr"/>
-          </a:solidFill>
-          <a:prstDash val="solid"/>
-          <a:miter lim="800000"/>
-        </a:ln>
-      </a:lnStyleLst>
-      <a:effectStyleLst>
-        <a:effectStyle>
-          <a:effectLst/>
-        </a:effectStyle>
-        <a:effectStyle>
-          <a:effectLst/>
-        </a:effectStyle>
-        <a:effectStyle>
-          <a:effectLst>
-            <a:outerShdw blurRad="57150" dist="19050" dir="5400000" algn="ctr" rotWithShape="false">
-              <a:srgbClr val="000000">
-                <a:alpha val="63000"/>
-              </a:srgbClr>
-            </a:outerShdw>
-          </a:effectLst>
-        </a:effectStyle>
-      </a:effectStyleLst>
-      <a:bgFillStyleLst>
-        <a:solidFill>
-          <a:schemeClr val="phClr"/>
-        </a:solidFill>
-        <a:solidFill>
-          <a:schemeClr val="phClr">
-            <a:tint val="95000"/>
-            <a:satMod val="170000"/>
-          </a:schemeClr>
-        </a:solidFill>
-        <a:gradFill rotWithShape="true">
-          <a:gsLst>
-            <a:gs pos="0">
-              <a:schemeClr val="phClr">
-                <a:tint val="93000"/>
-                <a:satMod val="150000"/>
-                <a:shade val="98000"/>
-                <a:lumMod val="102000"/>
-              </a:schemeClr>
-            </a:gs>
-            <a:gs pos="50000">
-              <a:schemeClr val="phClr">
-                <a:tint val="98000"/>
-                <a:satMod val="130000"/>
-                <a:shade val="90000"/>
-                <a:lumMod val="103000"/>
-              </a:schemeClr>
-            </a:gs>
-            <a:gs pos="100000">
-              <a:schemeClr val="phClr">
-                <a:shade val="63000"/>
-                <a:satMod val="120000"/>
-              </a:schemeClr>
-            </a:gs>
-          </a:gsLst>
-          <a:lin ang="5400000" scaled="false"/>
-        </a:gradFill>
-      </a:bgFillStyleLst>
-    </a:fmtScheme>
-  </a:themeElements>
-  <a:objectDefaults/>
-  <a:extraClrSchemeLst/>
-</a:theme>
 </file>
</xml_diff>